<commit_message>
Rewrite response letter in paper voice
</commit_message>
<xml_diff>
--- a/docs/response_to_reviewers.docx
+++ b/docs/response_to_reviewers.docx
@@ -85,7 +85,7 @@
           <w:b w:val="0"/>
           <w:i w:val="0"/>
         </w:rPr>
-        <w:t>We thank the Associate Editor and all four reviewers for their thorough and constructive comments. This revision addresses every concern raised.</w:t>
+        <w:t>The Associate Editor and all four reviewers raised substantive concerns that this revision addresses in full. We thank them for the careful reading.</w:t>
       </w:r>
     </w:p>
     <w:p>
@@ -106,28 +106,14 @@
           <w:b/>
           <w:i w:val="0"/>
         </w:rPr>
-        <w:t>Experimental foundation completely rebuilt.</w:t>
+        <w:t>Experimental foundation rebuilt.</w:t>
       </w:r>
       <w:r>
         <w:rPr>
           <w:b w:val="0"/>
           <w:i w:val="0"/>
         </w:rPr>
-        <w:t xml:space="preserve"> The PX4 SITL dataset (209 flights, test set augmented by TimeGAN) has been entirely replaced by a MATLAB UAV Toolbox simulation of 3,000 independent flights (1,800 train / 600 val / 600 test; ≥229 attacked per split). TimeGAN augmentation is now applied </w:t>
-      </w:r>
-      <w:r>
-        <w:rPr>
-          <w:b w:val="0"/>
-          <w:i/>
-        </w:rPr>
-        <w:t>only</w:t>
-      </w:r>
-      <w:r>
-        <w:rPr>
-          <w:b w:val="0"/>
-          <w:i w:val="0"/>
-        </w:rPr>
-        <w:t xml:space="preserve"> to the training split; the evaluation splits are strictly isolated from synthetic data.</w:t>
+        <w:t xml:space="preserve"> The PX4 SITL dataset (209 flights, TimeGAN-contaminated) is replaced by 3,000 MATLAB UAV Toolbox flights (1,800 train / 600 val / 600 test; ≥229 attacked per split). TimeGAN augmentation is applied to the training split only; evaluation splits are strictly isolated from synthetic data.</w:t>
       </w:r>
     </w:p>
     <w:p>
@@ -139,14 +125,14 @@
           <w:b/>
           <w:i w:val="0"/>
         </w:rPr>
-        <w:t>Real-world zero-shot evaluation added (§V-G).</w:t>
+        <w:t>Zero-shot real-world evaluation added (§V-G).</w:t>
       </w:r>
       <w:r>
         <w:rPr>
           <w:b w:val="0"/>
           <w:i w:val="0"/>
         </w:rPr>
-        <w:t xml:space="preserve"> All MATLAB-trained models are evaluated without fine-tuning on the IEEE DataPort UAV Attack Dataset and the ALFA fixed-wing dataset.</w:t>
+        <w:t xml:space="preserve"> All MATLAB-trained checkpoints are evaluated without fine-tuning on the IEEE DataPort UAV Attack Dataset and the ALFA fixed-wing dataset.</w:t>
       </w:r>
     </w:p>
     <w:p>
@@ -158,14 +144,14 @@
           <w:b/>
           <w:i w:val="0"/>
         </w:rPr>
-        <w:t>Statistical rigour: 5 seeds × 1000-iter bootstrap CI (§V).</w:t>
+        <w:t>5 seeds × 1,000-iteration bootstrap CI throughout (§V).</w:t>
       </w:r>
       <w:r>
         <w:rPr>
           <w:b w:val="0"/>
           <w:i w:val="0"/>
         </w:rPr>
-        <w:t xml:space="preserve"> Every table column now reports mean ± 95% CI. Pairwise paired </w:t>
+        <w:t xml:space="preserve"> Every table column reports mean ± 95% CI; pairwise paired </w:t>
       </w:r>
       <w:r>
         <w:rPr>
@@ -179,7 +165,7 @@
           <w:b w:val="0"/>
           <w:i w:val="0"/>
         </w:rPr>
-        <w:t>-tests with Bonferroni correction are reported for the DR@5s comparison.</w:t>
+        <w:t>-tests with Bonferroni correction are reported for DR@5s.</w:t>
       </w:r>
     </w:p>
     <w:p>
@@ -226,7 +212,7 @@
           <w:b w:val="0"/>
           <w:i w:val="0"/>
         </w:rPr>
-        <w:t xml:space="preserve"> ∈ {3, 5, 10}, and threshold sensitivity are reported; per-attack-type performance is reported in §V-E.</w:t>
+        <w:t xml:space="preserve"> ∈ {3, 5, 10}, and threshold sensitivity are reported; per-attack-type performance is in §V-E.</w:t>
       </w:r>
     </w:p>
     <w:p>
@@ -238,14 +224,14 @@
           <w:b/>
           <w:i w:val="0"/>
         </w:rPr>
-        <w:t>Framework novelty clarified vs. prior work (§III-D).</w:t>
+        <w:t>Framework novelty distinguished from prior work (§III-D).</w:t>
       </w:r>
       <w:r>
         <w:rPr>
           <w:b w:val="0"/>
           <w:i w:val="0"/>
         </w:rPr>
-        <w:t xml:space="preserve"> A new subsection distinguishes our contributions from Tatbul et al., NAB, and classical IDS metrics on four axes.</w:t>
+        <w:t xml:space="preserve"> A new subsection separates our contributions from Tatbul et al., NAB, and classical IDS metrics on four axes.</w:t>
       </w:r>
     </w:p>
     <w:p>
@@ -264,7 +250,7 @@
           <w:b w:val="0"/>
           <w:i w:val="0"/>
         </w:rPr>
-        <w:t xml:space="preserve"> DR@5s ≥ 85% is now justified from speed × time → displacement → GB 26860-2011 safety distance. Domain analogies are demoted to supporting evidence.</w:t>
+        <w:t xml:space="preserve"> DR@5s ≥ 85% is now derived from speed × time → displacement → GB 26860-2011 safety distance; domain analogies are retained only as supporting evidence.</w:t>
       </w:r>
     </w:p>
     <w:p>
@@ -288,7 +274,14 @@
           <w:b/>
           <w:i w:val="0"/>
         </w:rPr>
-        <w:t>Section V reframed as Case Study; Section VI (Discussion) added with subsections §VI-A (Generality), §VI-B (Cross-Distribution Evaluation), §VI-C (Limitations and Future Work).</w:t>
+        <w:t>§V reframed as Case Study; §VI (Discussion) added</w:t>
+      </w:r>
+      <w:r>
+        <w:rPr>
+          <w:b w:val="0"/>
+          <w:i w:val="0"/>
+        </w:rPr>
+        <w:t xml:space="preserve"> with subsections §VI-A (Generality), §VI-B (Cross-Distribution Evaluation), §VI-C (Limitations and Future Work).</w:t>
       </w:r>
     </w:p>
     <w:p>
@@ -392,7 +385,7 @@
           <w:b w:val="0"/>
           <w:i w:val="0"/>
         </w:rPr>
-        <w:t xml:space="preserve"> The reviewer is correct. We have completely rebuilt the experimental foundation. The new primary dataset is generated by the MATLAB UAV Toolbox (3,000 independent flights; see §IV-A) with a strict train-only augmentation policy. The test set (600 flights, 229 attacked) receives no augmentation of any kind. The PX4 SITL dataset and all results derived from it have been removed. The augmentation isolation guarantee is documented in §IV-A prose: no synthetic data is used in any reported experiment, and the optional TimeGAN script in the released codebase includes a runtime assertion that prevents any augmented flight ID from appearing in validation or test splits.</w:t>
+        <w:t xml:space="preserve"> The reviewer's diagnosis is correct. The experimental foundation has been completely rebuilt. The new primary dataset is generated by the MATLAB UAV Toolbox (3,000 independent flights; §IV-A) under a strict train-only augmentation policy: the test set (600 flights, 229 attacked) receives no augmentation of any kind. The PX4 SITL dataset and all results derived from it have been removed. §IV-A documents the isolation guarantee; the released codebase includes a runtime assertion that prevents any augmented flight ID from appearing in validation or test splits.</w:t>
       </w:r>
     </w:p>
     <w:p>
@@ -410,7 +403,7 @@
           <w:i w:val="0"/>
           <w:color w:val="0064B4"/>
         </w:rPr>
-        <w:t xml:space="preserve"> §IV-A completely rewritten; augmentation-isolation guarantee documented in §IV-A prose. Old Table I (TimeGAN config) removed.</w:t>
+        <w:t xml:space="preserve"> §IV-A completely rewritten; augmentation-isolation guarantee documented in §IV-A prose. Old Table I (TimeGAN configuration) removed.</w:t>
       </w:r>
     </w:p>
     <w:p>
@@ -466,7 +459,7 @@
           <w:i w:val="0"/>
           <w:color w:val="0064B4"/>
         </w:rPr>
-        <w:t xml:space="preserve"> Dataset scale table added (§IV-A, Table I). All result tables updated with CI columns.</w:t>
+        <w:t xml:space="preserve"> Dataset scale documented in Table I (§IV-A). All result tables regenerated with CI columns.</w:t>
       </w:r>
     </w:p>
     <w:p>
@@ -504,7 +497,7 @@
           <w:b w:val="0"/>
           <w:i w:val="0"/>
         </w:rPr>
-        <w:t xml:space="preserve"> We add a zero-shot cross-distribution evaluation in §V-G covering three additional data sources: (i) the IEEE DataPort UAV Attack Dataset live hardware flights (Holybro S500 + HackRF GPS spoofing; jamming flight excluded so the label space matches the detector), (ii) the IEEE DataPort PX4 SITL flights across four airframes (PLANE / VTOL / TAIL / H480), and (iii) the ALFA Carbon-Z fixed-wing dataset (CMU AirLab; with parameterised synthetic step spoofing injection on the no-failure segments). All MATLAB-trained checkpoints are evaluated zero-shot without fine-tuning. We frame this explicitly as a </w:t>
+        <w:t xml:space="preserve"> §V-G adds a zero-shot cross-distribution evaluation covering three sources: (i) IEEE DataPort UAV Attack Dataset live hardware flights (Holybro S500 + HackRF GPS spoofing; jamming flight excluded to match the detector's label space), (ii) IEEE DataPort PX4 SITL flights across four airframes (PLANE / VTOL / TAIL / H480), and (iii) the ALFA Carbon-Z fixed-wing dataset (CMU AirLab; parameterised synthetic step spoofing injected on no-failure segments). All MATLAB-trained checkpoints are evaluated zero-shot without fine-tuning. This evaluation is framed explicitly as a </w:t>
       </w:r>
       <w:r>
         <w:rPr>
@@ -518,7 +511,7 @@
           <w:b w:val="0"/>
           <w:i w:val="0"/>
         </w:rPr>
-        <w:t xml:space="preserve"> rather than matched-platform deployment validation: the three sources differ from the training distribution along multiple axes (vehicle airframe, cruise speed, sensor noise statistics, attack mechanism). The evaluation surfaces two findings: (a) in-distribution architecture ranking is not preserved across distributions — CNN-LSTM (in-distribution DR@5s = 0.958) drops to 0.200 on the live HackRF data; (b) precision collapses uniformly to 0.38–0.42 on the live data across all architectures. A controlled §V-H experiment then isolates the platform-speed-matching axis specifically; see response to Reviewer 3 Comment 5.</w:t>
+        <w:t>, not matched-platform deployment validation: the three sources differ from the training distribution along multiple axes simultaneously (vehicle airframe, cruise speed, sensor noise statistics, attack mechanism). Two findings emerge: in-distribution architecture ranking is not preserved across distributions — CNN-LSTM (in-distribution DR@5s = 0.958) drops to 0.200 on the live HackRF data — and precision collapses uniformly to 0.38–0.42 on the live data across all architectures. §V-H then isolates the platform-speed-matching axis specifically (see response to Reviewer 3, Comment 5).</w:t>
       </w:r>
     </w:p>
     <w:p>
@@ -536,7 +529,7 @@
           <w:i w:val="0"/>
           <w:color w:val="0064B4"/>
         </w:rPr>
-        <w:t xml:space="preserve"> New §V-G (cross-distribution evaluation, three data sources) + new §V-H (controlled platform-matching experiment) + Fig. </w:t>
+        <w:t xml:space="preserve"> §V-G (cross-distribution evaluation, three sources) + §V-H (controlled platform-matching experiment) + Fig. </w:t>
       </w:r>
       <w:r>
         <w:rPr>
@@ -592,7 +585,7 @@
           <w:i w:val="0"/>
           <w:color w:val="0064B4"/>
         </w:rPr>
-        <w:t>. §VI-C (Limitations) explicitly disclaims strict sim-to-real scope.</w:t>
+        <w:t xml:space="preserve"> added. §VI-C (Limitations) explicitly disclaims strict sim-to-real scope.</w:t>
       </w:r>
     </w:p>
     <w:p>
@@ -630,7 +623,7 @@
           <w:b w:val="0"/>
           <w:i w:val="0"/>
         </w:rPr>
-        <w:t xml:space="preserve"> We have rewritten §IV-E with risk-based derivation as the primary argument. At a cruise speed of 5 m/s and a 5-second detection budget, a spoofed UAV drifts 25 m; adding the 1 s mitigation latency gives 30 m total displacement, and GB 26860-2011 specifies a 5 m safe-approach distance to 500 kV lines against a 35 m planned standoff, leaving a 30 m abort margin. DR@5s ≥ 85% means at least 85% of attacks are caught before this margin is exhausted. The MTBFA ≥ 0.1 h threshold follows from a ≤10 nuisance-alarm budget per 1-hour inspection tour (Axelsson [ref10]). Medical/industrial analogies from ISO 11064-5 [ref32] are retained only as supporting analogy.</w:t>
+        <w:t xml:space="preserve"> §IV-E has been rewritten with risk-based derivation as the primary argument. At a cruise speed of 5 m/s and a 5-second detection budget, a spoofed UAV drifts 25 m; adding 1 s mitigation latency gives 30 m total displacement. GB 26860-2011 specifies a 5 m safe-approach distance to 500 kV lines against a 35 m planned standoff, leaving a 30 m abort margin. DR@5s ≥ 85% means at least 85% of attacks are caught before this margin is exhausted. The MTBFA ≥ 0.1 h threshold follows from a ≤10 nuisance-alarm budget per 1-hour inspection tour (Axelsson [ref10]). Medical/industrial analogies from ISO 11064-5 [ref32] are retained only as supporting evidence.</w:t>
       </w:r>
     </w:p>
     <w:p>
@@ -648,7 +641,7 @@
           <w:i w:val="0"/>
           <w:color w:val="0064B4"/>
         </w:rPr>
-        <w:t xml:space="preserve"> §IV-E substantially rewritten with risk equation and GB 26860-2011 citation as primary basis. Domain-analogy references demoted to supporting evidence.</w:t>
+        <w:t xml:space="preserve"> §IV-E substantially rewritten with the risk equation and GB 26860-2011 citation as the primary basis. Domain-analogy references demoted to supporting evidence.</w:t>
       </w:r>
     </w:p>
     <w:p>
@@ -700,7 +693,7 @@
           <w:b w:val="0"/>
           <w:i w:val="0"/>
         </w:rPr>
-        <w:t>-tests with Bonferroni correction (α-adjusted for C(7,2) = 21 comparisons) are reported for the DR@5s metric. Significant pairs are marked in the tables.</w:t>
+        <w:t>-tests with Bonferroni correction (α-adjusted for C(7,2) = 21 comparisons) are reported for DR@5s; significant pairs are marked in the tables.</w:t>
       </w:r>
     </w:p>
     <w:p>
@@ -824,7 +817,7 @@
           <w:b w:val="0"/>
           <w:i w:val="0"/>
         </w:rPr>
-        <w:t xml:space="preserve"> (9 configurations). DR@5s ranges only 0.924–0.965 across the entire grid, confirming that architectural conclusions are not artifacts of windowing choices.</w:t>
+        <w:t xml:space="preserve"> (9 configurations). DR@5s ranges only 0.924–0.965 across the entire grid, confirming that architectural conclusions are not artifacts of windowing choices. The threshold-sensitivity paragraph in §V-D reports that at p = 0.5 all architectures' MTBFA falls in 0.016–0.043 h, establishing that the deployability gap is structural.</w:t>
       </w:r>
     </w:p>
     <w:p>
@@ -842,7 +835,7 @@
           <w:i w:val="0"/>
           <w:color w:val="0064B4"/>
         </w:rPr>
-        <w:t xml:space="preserve"> §V-D (Robustness Analysis) added; window/step heat-map figure added. The threshold-sensitivity paragraph in §V-D documents that at p = 0.5 all architectures' MTBFA falls in 0.016–0.043 h, establishing that the deployability gap is structural.</w:t>
+        <w:t xml:space="preserve"> §V-D (Robustness Analysis) added; window/step heatmap figure added.</w:t>
       </w:r>
     </w:p>
     <w:p>
@@ -880,7 +873,7 @@
           <w:b w:val="0"/>
           <w:i w:val="0"/>
         </w:rPr>
-        <w:t xml:space="preserve"> ref27 (NHS guidance) and ref33 (EEMUA 191) were removed: the medical/industrial analogies they supported are no longer the primary basis for the deployability thresholds, which are now derived from UAV-specific risk constraints (§IV-E). ref31 (PX4 documentation) was likewise removed when the experimental foundation switched from PX4 SITL to the MATLAB UAV Toolbox pipeline. ref30 (GB 26860-2011) is retained as the load-bearing safety-distance citation with full publisher and SAC URL. ref32 (ISO 11064-5:2008) is retained as a single supporting-analogy citation with full bibliographic detail and a publicly accessible URL.</w:t>
+        <w:t xml:space="preserve"> ref27 (NHS guidance) and ref33 (EEMUA 191) were removed: the medical/industrial analogies they supported are no longer the primary basis for deployability thresholds, which are now derived from UAV-specific risk constraints (§IV-E). ref31 (PX4 documentation) was removed when the experimental foundation switched from PX4 SITL to the MATLAB UAV Toolbox pipeline. ref30 (GB 26860-2011) is retained as the load-bearing safety-distance citation with full publisher and SAC URL. ref32 (ISO 11064-5:2008) is retained as a single supporting-analogy citation with full bibliographic detail and a publicly accessible URL.</w:t>
       </w:r>
     </w:p>
     <w:p>
@@ -978,7 +971,7 @@
           <w:b w:val="0"/>
           <w:i w:val="0"/>
         </w:rPr>
-        <w:t xml:space="preserve"> We have added a notation summary table (Table </w:t>
+        <w:t xml:space="preserve"> Table </w:t>
       </w:r>
       <w:r>
         <w:rPr>
@@ -991,7 +984,7 @@
           <w:b w:val="0"/>
           <w:i w:val="0"/>
         </w:rPr>
-        <w:t>) at the beginning of §III, listing all symbols τ_k, t_s, t_d, Δt, L, S, f_s, K, N, F with their definitions and units. This table is the single authoritative reference for all notation used in the framework and case-study sections.</w:t>
+        <w:t xml:space="preserve"> (§III) now lists all symbols τ_k, t_s, t_d, Δt, L, S, f_s, K, N, F with their definitions and units. This table is the single authoritative reference for all notation used in the framework and case-study sections.</w:t>
       </w:r>
     </w:p>
     <w:p>
@@ -1023,7 +1016,7 @@
           <w:i w:val="0"/>
           <w:color w:val="0064B4"/>
         </w:rPr>
-        <w:t xml:space="preserve"> (Notation) added in §III.</w:t>
+        <w:t xml:space="preserve"> added in §III.</w:t>
       </w:r>
     </w:p>
     <w:p>
@@ -1061,7 +1054,7 @@
           <w:b w:val="0"/>
           <w:i w:val="0"/>
         </w:rPr>
-        <w:t xml:space="preserve"> We have added (a) a full algorithmic specification of the rising-edge counting logic in §III-B-2 (the false-alarm event algorithm listing); (b) a concrete numerical worked example (Detector A: 100 FP windows → 10 events, MTBFA = 0.2 h; Detector B: 200 FP windows → 5 events, MTBFA = 0.4 h) in Table </w:t>
+        <w:t xml:space="preserve"> §III-B-2 now contains (a) a full algorithmic specification of the rising-edge counting logic; (b) a concrete numerical worked example — Detector A: 100 FP windows → 10 events, MTBFA = 0.2 h; Detector B: 200 FP windows → 5 events, MTBFA = 0.4 h — in Table </w:t>
       </w:r>
       <w:r>
         <w:rPr>
@@ -1074,7 +1067,7 @@
           <w:b w:val="0"/>
           <w:i w:val="0"/>
         </w:rPr>
-        <w:t xml:space="preserve">, showing how higher precision can coexist with lower MTBFA; and (c) a figure (Fig. </w:t>
+        <w:t xml:space="preserve">, showing how higher precision can coexist with lower MTBFA; and (c) Fig. </w:t>
       </w:r>
       <w:r>
         <w:rPr>
@@ -1087,7 +1080,7 @@
           <w:b w:val="0"/>
           <w:i w:val="0"/>
         </w:rPr>
-        <w:t>) illustrating the paradox empirically.</w:t>
+        <w:t xml:space="preserve"> illustrating the paradox empirically.</w:t>
       </w:r>
     </w:p>
     <w:p>
@@ -1105,7 +1098,7 @@
           <w:i w:val="0"/>
           <w:color w:val="0064B4"/>
         </w:rPr>
-        <w:t xml:space="preserve"> §III-B-2 algorithm + numerical example Table </w:t>
+        <w:t xml:space="preserve"> §III-B-2 algorithm + Table </w:t>
       </w:r>
       <w:r>
         <w:rPr>
@@ -1171,7 +1164,7 @@
           <w:b w:val="0"/>
           <w:i w:val="0"/>
         </w:rPr>
-        <w:t xml:space="preserve"> A new §III-D (</w:t>
+        <w:t xml:space="preserve"> §III-D (</w:t>
       </w:r>
       <w:r>
         <w:rPr>
@@ -1185,7 +1178,7 @@
           <w:b w:val="0"/>
           <w:i w:val="0"/>
         </w:rPr>
-        <w:t>) explicitly distinguishes our contributions from Tatbul et al.'s range-based time-series metrics (offline, no user-specified time budget), the NAB score, and classical IDS false-alarm metrics (fractional FPR rather than time-between-event measures). Our contribution is the systematisation of explicit time-budgeted DR@Δt with first-detection causality, event-level MTBFA in operational time units, deployment-grounded threshold derivation, and a multi-distribution UAV case study.</w:t>
+        <w:t>) distinguishes our contributions from Tatbul et al.'s range-based time-series metrics (offline, no user-specified time budget), the NAB score, and classical IDS false-alarm metrics (fractional FPR rather than time-between-event measures). Our contribution is the systematisation of explicit time-budgeted DR@Δt with first-detection causality, event-level MTBFA in operational time units, deployment-grounded threshold derivation, and a multi-distribution UAV case study.</w:t>
       </w:r>
     </w:p>
     <w:p>
@@ -1241,7 +1234,7 @@
           <w:b w:val="0"/>
           <w:i w:val="0"/>
         </w:rPr>
-        <w:t xml:space="preserve"> Section V has been renamed </w:t>
+        <w:t xml:space="preserve"> §V has been renamed </w:t>
       </w:r>
       <w:r>
         <w:rPr>
@@ -1255,7 +1248,7 @@
           <w:b w:val="0"/>
           <w:i w:val="0"/>
         </w:rPr>
-        <w:t xml:space="preserve"> and every subsection is framed as a demonstration of the framework's discriminative power rather than an architectural recommendation. The Abstract and Introduction explicitly state that metric values depend on training data and hyperparameters, and that what remains invariant is the framework's ability to reveal detectors that pass conventional metrics but fail operational standards. §VI-A (Generality of the Framework) further elaborates the detector-agnostic and task-agnostic design.</w:t>
+        <w:t>; every subsection is framed as a demonstration of the framework's discriminative power rather than an architectural recommendation. The Abstract and Introduction now state explicitly that metric values depend on training data and hyperparameters, and that what remains invariant is the framework's ability to reveal detectors that pass conventional metrics but fail operational standards. §VI-A (Generality of the Framework) elaborates the detector-agnostic and task-agnostic design.</w:t>
       </w:r>
     </w:p>
     <w:p>
@@ -1273,7 +1266,7 @@
           <w:i w:val="0"/>
           <w:color w:val="0064B4"/>
         </w:rPr>
-        <w:t xml:space="preserve"> §V retitled and reframed; Abstract and Introduction revised; §VI (Discussion) added with §VI-A (Generality).</w:t>
+        <w:t xml:space="preserve"> §V retitled and reframed; Abstract and Introduction revised; §VI-A (Generality) added.</w:t>
       </w:r>
     </w:p>
     <w:p>
@@ -1311,7 +1304,7 @@
           <w:b w:val="0"/>
           <w:i w:val="0"/>
         </w:rPr>
-        <w:t xml:space="preserve"> A new §IV-F (Reproducibility) provides the architecture summary table (Table </w:t>
+        <w:t xml:space="preserve"> §IV-F (Reproducibility) provides the architecture summary table (Table </w:t>
       </w:r>
       <w:r>
         <w:rPr>
@@ -1337,7 +1330,7 @@
           <w:b w:val="0"/>
           <w:i w:val="0"/>
         </w:rPr>
-        <w:t>), and a public code repository URL (https://github.com/jawkjiang/UAV). The MATLAB simulation pipeline and Python detection pipeline are both open-sourced with sufficient instructions to reproduce all 3,000 flights, all 35 trained checkpoints, and every table and figure.</w:t>
+        <w:t>), and a public code repository URL (https://github.com/jawkjiang/UAV). Both the MATLAB simulation pipeline and the Python detection pipeline are open-sourced with sufficient instructions to reproduce all 3,000 flights, all 35 trained checkpoints, and every table and figure.</w:t>
       </w:r>
     </w:p>
     <w:p>
@@ -1431,7 +1424,20 @@
           <w:b w:val="0"/>
           <w:i w:val="0"/>
         </w:rPr>
-        <w:t xml:space="preserve"> The dataset has been completely replaced. The new test set alone contains 600 flights with 229 attacked flights — more than 13× more attack instances than the original test set. The full 3,000-flight dataset spans 1,800 / 600 / 600 train / val / test flights at the flight level, preventing data leakage across splits.</w:t>
+        <w:t xml:space="preserve"> The dataset has been completely replaced. The new test set alone contains 600 flights with 229 attacked flights — more than 13× the original attack count. The full 3,000-flight dataset spans 1,800 / 600 / 600 train / val / test flights at the flight level, preventing data leakage across splits. Table </w:t>
+      </w:r>
+      <w:r>
+        <w:rPr>
+          <w:rFonts w:ascii="Consolas" w:hAnsi="Consolas"/>
+        </w:rPr>
+        <w:t>tab:dataset</w:t>
+      </w:r>
+      <w:r>
+        <w:rPr>
+          <w:b w:val="0"/>
+          <w:i w:val="0"/>
+        </w:rPr>
+        <w:t xml:space="preserve"> (§IV-A) documents the full scale.</w:t>
       </w:r>
     </w:p>
     <w:p>
@@ -1449,21 +1455,7 @@
           <w:i w:val="0"/>
           <w:color w:val="0064B4"/>
         </w:rPr>
-        <w:t xml:space="preserve"> See response to Reviewer 1, Comment 2. Table </w:t>
-      </w:r>
-      <w:r>
-        <w:rPr>
-          <w:rFonts w:ascii="Consolas" w:hAnsi="Consolas"/>
-        </w:rPr>
-        <w:t>tab:dataset</w:t>
-      </w:r>
-      <w:r>
-        <w:rPr>
-          <w:b w:val="0"/>
-          <w:i w:val="0"/>
-          <w:color w:val="0064B4"/>
-        </w:rPr>
-        <w:t xml:space="preserve"> (§IV-A) documents the full dataset scale.</w:t>
+        <w:t xml:space="preserve"> See response to Reviewer 1, Comment 2.</w:t>
       </w:r>
     </w:p>
     <w:p>
@@ -1501,7 +1493,7 @@
           <w:b w:val="0"/>
           <w:i w:val="0"/>
         </w:rPr>
-        <w:t xml:space="preserve"> We add zero-shot evaluation on two real-world datasets (IEEE DataPort live hardware flights and ALFA fixed-wing) in §V-G and explicitly characterise the cross-distribution gap in §VI-B and §VI-C. The MATLAB sensor model limitations (no multipath, ionospheric delay, or receiver clock drift) are acknowledged in §IV-A and §VI-C. We frame the evaluation honestly as a </w:t>
+        <w:t xml:space="preserve"> Zero-shot evaluation on two real-world datasets (IEEE DataPort live hardware flights and ALFA fixed-wing) is added in §V-G; the cross-distribution gap is characterised in §VI-B and §VI-C. The MATLAB sensor model limitations — no multipath, ionospheric delay, or receiver clock drift — are acknowledged in §IV-A and §VI-C. The evaluation is framed as a </w:t>
       </w:r>
       <w:r>
         <w:rPr>
@@ -1515,7 +1507,7 @@
           <w:b w:val="0"/>
           <w:i w:val="0"/>
         </w:rPr>
-        <w:t xml:space="preserve"> rather than matched-platform sim-to-real validation, because the real flights differ from the training distribution along multiple axes simultaneously.</w:t>
+        <w:t>: the real flights differ from the training distribution along multiple axes simultaneously, so the gap cannot be attributed to any single factor.</w:t>
       </w:r>
     </w:p>
     <w:p>
@@ -1533,7 +1525,7 @@
           <w:i w:val="0"/>
           <w:color w:val="0064B4"/>
         </w:rPr>
-        <w:t xml:space="preserve"> See response to Reviewer 1, Comment 3. §VI-C (Limitations) documents sensor-model fidelity gap.</w:t>
+        <w:t xml:space="preserve"> See response to Reviewer 1, Comment 3. §VI-C documents the sensor-model fidelity gap.</w:t>
       </w:r>
     </w:p>
     <w:p>
@@ -1571,7 +1563,7 @@
           <w:b w:val="0"/>
           <w:i w:val="0"/>
         </w:rPr>
-        <w:t xml:space="preserve"> Four 2024 papers have been added and integrated into the Introduction. Specifically: </w:t>
+        <w:t xml:space="preserve"> Four 2024 papers have been added. </w:t>
       </w:r>
       <w:r>
         <w:rPr>
@@ -1599,7 +1591,7 @@
           <w:b w:val="0"/>
           <w:i w:val="0"/>
         </w:rPr>
-        <w:t xml:space="preserve">, vol. 24, no. 18, Sep. 2024 (doi: 10.3390/s24186156) — cited in §I for adversarial-ML-based detection; </w:t>
+        <w:t xml:space="preserve">, vol. 24, no. 18, Sep. 2024 (doi: 10.3390/s24186156) — cited in §I for adversarial-ML-based detection. </w:t>
       </w:r>
       <w:r>
         <w:rPr>
@@ -1627,7 +1619,7 @@
           <w:b w:val="0"/>
           <w:i w:val="0"/>
         </w:rPr>
-        <w:t xml:space="preserve">, vol. 74, no. 10, Nov. 2024 (doi: 10.1016/j.asr.2024.07.016) — cited in §I for Transformer-based real-time GNSS detection; </w:t>
+        <w:t xml:space="preserve">, vol. 74, no. 10, Nov. 2024 (doi: 10.1016/j.asr.2024.07.016) — cited in §I for Transformer-based real-time GNSS detection. </w:t>
       </w:r>
       <w:r>
         <w:rPr>
@@ -1641,7 +1633,7 @@
           <w:b w:val="0"/>
           <w:i w:val="0"/>
         </w:rPr>
-        <w:t xml:space="preserve"> Humphreys et al. (classic ION GNSS 2008 spoofer reference, cited in the threat model); and </w:t>
+        <w:t xml:space="preserve"> Humphreys et al. (ION GNSS 2008 spoofer reference, cited in the threat model). </w:t>
       </w:r>
       <w:r>
         <w:rPr>
@@ -1655,7 +1647,7 @@
           <w:b w:val="0"/>
           <w:i w:val="0"/>
         </w:rPr>
-        <w:t xml:space="preserve"> the IEEE DataPort UAV Attack Dataset (doi: 10.21227/00dg-0d12), used as the real-hardware evaluation source in §V-G. Additional 2024–2025 works already in the bibliography (ref15, ref16, ref20, ref21, ref25, ref29) provide further coverage.</w:t>
+        <w:t xml:space="preserve"> IEEE DataPort UAV Attack Dataset (doi: 10.21227/00dg-0d12), the real-hardware evaluation source for §V-G. Additional 2024–2025 works already in the bibliography (ref15, ref16, ref20, ref21, ref25, ref29) provide further coverage.</w:t>
       </w:r>
     </w:p>
     <w:p>
@@ -1767,7 +1759,7 @@
           <w:b w:val="0"/>
           <w:i w:val="0"/>
         </w:rPr>
-        <w:t xml:space="preserve"> This was an artefact of the contaminated test set, where TimeGAN-generated data inflated window-level accuracy uniformly. With the new clean test set, both metric families show clearly differentiated patterns: conventional precision spans 0.79–0.90, recall spans 0.56–0.91, F1 spans 0.69–0.90. Time-aware metrics span a wider range: DR@5s spans 0.75–0.96, ADD spans 0.90–4.68 s, MTBFA spans 0.016–0.043 h. Crucially, rank ordering by F1 differs from rank ordering by ADD — CNN-LSTM leads both F1 and ADD, but TCN ranks 7th on F1 yet 5th on DR@5s — demonstrating that the two metric families surface different architecture properties. Bonferroni-corrected pairwise </w:t>
+        <w:t xml:space="preserve"> This pattern was an artefact of the contaminated test set, where TimeGAN-generated data inflated window-level accuracy uniformly. With the new clean test set, both metric families show clearly differentiated patterns: conventional precision spans 0.79–0.90, recall spans 0.56–0.91, F1 spans 0.69–0.90. Time-aware metrics span a wider range: DR@5s spans 0.75–0.96, ADD spans 0.90–4.68 s, MTBFA spans 0.016–0.043 h. Rank ordering by F1 differs from rank ordering by ADD — CNN-LSTM leads both F1 and ADD, but TCN ranks 7th on F1 yet 5th on DR@5s — demonstrating that the two metric families surface different architecture properties. Bonferroni-corrected pairwise </w:t>
       </w:r>
       <w:r>
         <w:rPr>
@@ -1855,7 +1847,7 @@
           <w:i w:val="0"/>
           <w:color w:val="0064B4"/>
         </w:rPr>
-        <w:t xml:space="preserve"> in revised manuscript.</w:t>
+        <w:t xml:space="preserve"> in the revised manuscript.</w:t>
       </w:r>
     </w:p>
     <w:p>
@@ -1893,7 +1885,7 @@
           <w:b w:val="0"/>
           <w:i w:val="0"/>
         </w:rPr>
-        <w:t xml:space="preserve"> We have added citations to three documented real-world spoofing incidents in §IV-B: the 2011 RQ-170 Sentinel capture [ref24] (exemplifies combined Step/Takeover scenario), the 2013 Humphreys yacht-hijacking demonstration [ref49] (Drift pattern used to steer off course), and the 2016 Black Sea maritime spoofing cluster [ref50] (abrupt Step offsets causing vessels to report positions kilometres inland). Each attack type in our model is linked to its real-world analogue.</w:t>
+        <w:t xml:space="preserve"> §IV-B now cites three documented real-world spoofing incidents: the 2011 RQ-170 Sentinel capture [ref24] (exemplifies combined Step/Takeover scenario), the 2013 Humphreys yacht-hijacking demonstration [ref49] (Drift pattern used to steer off course), and the 2016 Black Sea maritime spoofing cluster [ref50] (abrupt Step offsets causing vessels to report positions kilometres inland). Each attack type in the model is linked to its real-world analogue.</w:t>
       </w:r>
     </w:p>
     <w:p>
@@ -1949,7 +1941,7 @@
           <w:b w:val="0"/>
           <w:i w:val="0"/>
         </w:rPr>
-        <w:t xml:space="preserve"> We have removed model-specific "high-risk" labels from the Abstract and throughout §V. The framing now presents findings as observations within our specific experimental conditions (this dataset, these attack parameters, this training protocol) rather than universal architectural properties. §V opens with an explicit caveat that specific metric values depend on training data and hyperparameters, and that the case study demonstrates the framework's discriminative power, not universal architectural rankings.</w:t>
+        <w:t xml:space="preserve"> "High-risk" labels have been removed from the Abstract and throughout §V. Findings are now presented as observations within the specific experimental conditions of this study — this dataset, these attack parameters, this training protocol — not as universal architectural properties. §V opens with an explicit caveat that specific metric values depend on training data and hyperparameters, and that the case study demonstrates the framework's discriminative power, not universal architectural rankings.</w:t>
       </w:r>
     </w:p>
     <w:p>
@@ -1967,7 +1959,7 @@
           <w:i w:val="0"/>
           <w:color w:val="0064B4"/>
         </w:rPr>
-        <w:t xml:space="preserve"> "high-risk" language removed from all instances in Abstract and §V. §V introductory paragraph added clarifying case-study scope.</w:t>
+        <w:t xml:space="preserve"> "High-risk" language removed from all instances in Abstract and §V. §V introductory paragraph added clarifying case-study scope.</w:t>
       </w:r>
     </w:p>
     <w:p/>
@@ -2015,7 +2007,7 @@
           <w:b w:val="0"/>
           <w:i w:val="0"/>
         </w:rPr>
-        <w:t xml:space="preserve"> See response to Reviewer 1, Comment 5. Paired </w:t>
+        <w:t xml:space="preserve"> Paired </w:t>
       </w:r>
       <w:r>
         <w:rPr>
@@ -2042,7 +2034,7 @@
           <w:b w:val="0"/>
           <w:i w:val="0"/>
         </w:rPr>
-        <w:t xml:space="preserve"> and referenced throughout §V.</w:t>
+        <w:t xml:space="preserve"> and referenced throughout §V. (See also response to Reviewer 1, Comment 5.)</w:t>
       </w:r>
     </w:p>
     <w:p>
@@ -2111,7 +2103,7 @@
           <w:b w:val="0"/>
           <w:i w:val="0"/>
         </w:rPr>
-        <w:t xml:space="preserve">): every architecture is evaluated separately on Step, Drift, Delay, and Takeover subsets, with attack parameters drawn from the ranges defined in §IV-B (step magnitude </w:t>
+        <w:t xml:space="preserve">): every architecture is evaluated separately on Step, Drift, Delay, and Takeover subsets, with attack parameters drawn from the ranges defined in §IV-B — step magnitude </w:t>
       </w:r>
       <w:r>
         <w:rPr>
@@ -2139,7 +2131,7 @@
           <w:b w:val="0"/>
           <w:i w:val="0"/>
         </w:rPr>
-        <w:t>\_drift ∈ {5, 10, 20} s, delay δ ∈ {1, 3, 5} s, takeover gain α ∈ {0.3, 0.5, 0.7}). The architecture-by-attack-type matrix surfaces interactions that aggregate DR@5s masks — most notably TCN's positional-vs-temporal asymmetry (Drift DR@5s = 0.463 vs Takeover DR@5s = 0.961) and a precision–recall divergence on Delay attacks across architectures. A full one-axis-at-a-time parameter sweep is outside the scope of this revision; the per-family randomisation over the ranges above provides representative coverage.</w:t>
+        <w:t>\_drift ∈ {5, 10, 20} s, delay δ ∈ {1, 3, 5} s, takeover gain α ∈ {0.3, 0.5, 0.7}. The architecture-by-attack-type matrix surfaces interactions that aggregate DR@5s masks: most notably TCN's positional-vs-temporal asymmetry (Drift DR@5s = 0.463 vs. Takeover DR@5s = 0.961) and a precision–recall divergence on Delay attacks across architectures. A full one-axis-at-a-time parameter sweep is outside the scope of this revision; the per-family randomisation over the ranges above provides representative coverage.</w:t>
       </w:r>
     </w:p>
     <w:p>
@@ -2265,7 +2257,7 @@
           <w:b w:val="0"/>
           <w:i w:val="0"/>
         </w:rPr>
-        <w:t xml:space="preserve">\_s = 5 × 10 = 50 ensures each window spans the full detection horizon. Step size </w:t>
+        <w:t xml:space="preserve">_s = 5 × 10 = 50 ensures each window spans the full detection horizon. Step size </w:t>
       </w:r>
       <w:r>
         <w:rPr>
@@ -2279,7 +2271,7 @@
           <w:b w:val="0"/>
           <w:i w:val="0"/>
         </w:rPr>
-        <w:t xml:space="preserve"> = 5 samples (0.5 s) balances temporal resolution against compute cost. A sensitivity sweep over </w:t>
+        <w:t xml:space="preserve"> = 5 samples (0.5 s) balances temporal resolution against compute cost. The sensitivity sweep over </w:t>
       </w:r>
       <w:r>
         <w:rPr>
@@ -2307,7 +2299,7 @@
           <w:b w:val="0"/>
           <w:i w:val="0"/>
         </w:rPr>
-        <w:t xml:space="preserve"> ∈ {3, 5, 10} is reported in §V-D (Table </w:t>
+        <w:t xml:space="preserve"> ∈ {3, 5, 10} (Table </w:t>
       </w:r>
       <w:r>
         <w:rPr>
@@ -2333,7 +2325,7 @@
           <w:b w:val="0"/>
           <w:i w:val="0"/>
         </w:rPr>
-        <w:t>); DR@5s varies only 0.924–0.965 across all nine configurations, confirming robustness of the architectural conclusions.</w:t>
+        <w:t>) shows DR@5s varying only 0.924–0.965 across all nine configurations, confirming robustness of the architectural conclusions.</w:t>
       </w:r>
     </w:p>
     <w:p>

</xml_diff>

<commit_message>
Regenerate response_to_reviewers.docx after all 8 convergence fixes
Co-Authored-By: Claude Sonnet 4.6 <noreply@anthropic.com>
</commit_message>
<xml_diff>
--- a/docs/response_to_reviewers.docx
+++ b/docs/response_to_reviewers.docx
@@ -146,7 +146,7 @@
           <w:color w:val="000000"/>
           <w:sz w:val="22"/>
         </w:rPr>
-        <w:t xml:space="preserve"> The PX4 SITL dataset (209 flights; TimeGAN augmentation applied before splitting, contaminating the test partition) is replaced by 3,000 MATLAB UAV Toolbox flights generated at 5 m/s cruise (1,800 train / 600 val / 600 test; 229 attacked per split). TimeGAN augmentation is now restricted to the training split; a runtime assertion in the data loader enforces strict isolation of the validation and test partitions from any synthetic flight identifier.</w:t>
+        <w:t xml:space="preserve"> The PX4 SITL dataset (209 flights; TimeGAN augmentation applied before splitting, contaminating the test partition) is replaced by 3,000 MATLAB UAV Toolbox flights generated at 5 m/s cruise (1,800 train / 600 val / 600 test; 739 / 237 / 229 attacked per split; 352,387 total sliding windows). TimeGAN exists only as an optional, non-default code module restricted to the training split via runtime assertion; all reported experiments use no synthetic augmentation.</w:t>
       </w:r>
     </w:p>
     <w:p>
@@ -720,16 +720,15 @@
         <w:tblLook w:firstColumn="1" w:firstRow="1" w:lastColumn="0" w:lastRow="0" w:noHBand="0" w:noVBand="1" w:val="04A0"/>
       </w:tblPr>
       <w:tblGrid>
-        <w:gridCol w:w="1881"/>
-        <w:gridCol w:w="1881"/>
-        <w:gridCol w:w="1881"/>
-        <w:gridCol w:w="1881"/>
-        <w:gridCol w:w="1881"/>
+        <w:gridCol w:w="2351"/>
+        <w:gridCol w:w="2351"/>
+        <w:gridCol w:w="2351"/>
+        <w:gridCol w:w="2351"/>
       </w:tblGrid>
       <w:tr>
         <w:tc>
           <w:tcPr>
-            <w:tcW w:type="dxa" w:w="1881"/>
+            <w:tcW w:type="dxa" w:w="2351"/>
           </w:tcPr>
           <w:p>
             <w:r>
@@ -746,7 +745,7 @@
         </w:tc>
         <w:tc>
           <w:tcPr>
-            <w:tcW w:type="dxa" w:w="1881"/>
+            <w:tcW w:type="dxa" w:w="2351"/>
           </w:tcPr>
           <w:p>
             <w:r>
@@ -763,7 +762,7 @@
         </w:tc>
         <w:tc>
           <w:tcPr>
-            <w:tcW w:type="dxa" w:w="1881"/>
+            <w:tcW w:type="dxa" w:w="2351"/>
           </w:tcPr>
           <w:p>
             <w:r>
@@ -780,24 +779,7 @@
         </w:tc>
         <w:tc>
           <w:tcPr>
-            <w:tcW w:type="dxa" w:w="1881"/>
-          </w:tcPr>
-          <w:p>
-            <w:r>
-              <w:rPr>
-                <w:rFonts w:ascii="Times New Roman" w:hAnsi="Times New Roman"/>
-                <w:b/>
-                <w:i w:val="0"/>
-                <w:color w:val="000000"/>
-                <w:sz w:val="22"/>
-              </w:rPr>
-              <w:t>Attack windows</w:t>
-            </w:r>
-          </w:p>
-        </w:tc>
-        <w:tc>
-          <w:tcPr>
-            <w:tcW w:type="dxa" w:w="1881"/>
+            <w:tcW w:type="dxa" w:w="2351"/>
           </w:tcPr>
           <w:p>
             <w:r>
@@ -816,7 +798,7 @@
       <w:tr>
         <w:tc>
           <w:tcPr>
-            <w:tcW w:type="dxa" w:w="1881"/>
+            <w:tcW w:type="dxa" w:w="2351"/>
           </w:tcPr>
           <w:p>
             <w:r>
@@ -833,7 +815,7 @@
         </w:tc>
         <w:tc>
           <w:tcPr>
-            <w:tcW w:type="dxa" w:w="1881"/>
+            <w:tcW w:type="dxa" w:w="2351"/>
           </w:tcPr>
           <w:p>
             <w:r>
@@ -850,52 +832,35 @@
         </w:tc>
         <w:tc>
           <w:tcPr>
-            <w:tcW w:type="dxa" w:w="1881"/>
-          </w:tcPr>
-          <w:p>
-            <w:r>
-              <w:rPr>
-                <w:rFonts w:ascii="Times New Roman" w:hAnsi="Times New Roman"/>
-                <w:b w:val="0"/>
-                <w:i w:val="0"/>
-                <w:color w:val="000000"/>
-                <w:sz w:val="22"/>
-              </w:rPr>
-              <w:t>687</w:t>
-            </w:r>
-          </w:p>
-        </w:tc>
-        <w:tc>
-          <w:tcPr>
-            <w:tcW w:type="dxa" w:w="1881"/>
-          </w:tcPr>
-          <w:p>
-            <w:r>
-              <w:rPr>
-                <w:rFonts w:ascii="Times New Roman" w:hAnsi="Times New Roman"/>
-                <w:b w:val="0"/>
-                <w:i w:val="0"/>
-                <w:color w:val="000000"/>
-                <w:sz w:val="22"/>
-              </w:rPr>
-              <w:t>≈10,200</w:t>
-            </w:r>
-          </w:p>
-        </w:tc>
-        <w:tc>
-          <w:tcPr>
-            <w:tcW w:type="dxa" w:w="1881"/>
-          </w:tcPr>
-          <w:p>
-            <w:r>
-              <w:rPr>
-                <w:rFonts w:ascii="Times New Roman" w:hAnsi="Times New Roman"/>
-                <w:b w:val="0"/>
-                <w:i w:val="0"/>
-                <w:color w:val="000000"/>
-                <w:sz w:val="22"/>
-              </w:rPr>
-              <w:t>208,908</w:t>
+            <w:tcW w:type="dxa" w:w="2351"/>
+          </w:tcPr>
+          <w:p>
+            <w:r>
+              <w:rPr>
+                <w:rFonts w:ascii="Times New Roman" w:hAnsi="Times New Roman"/>
+                <w:b w:val="0"/>
+                <w:i w:val="0"/>
+                <w:color w:val="000000"/>
+                <w:sz w:val="22"/>
+              </w:rPr>
+              <w:t>739 (41%)</w:t>
+            </w:r>
+          </w:p>
+        </w:tc>
+        <w:tc>
+          <w:tcPr>
+            <w:tcW w:type="dxa" w:w="2351"/>
+          </w:tcPr>
+          <w:p>
+            <w:r>
+              <w:rPr>
+                <w:rFonts w:ascii="Times New Roman" w:hAnsi="Times New Roman"/>
+                <w:b w:val="0"/>
+                <w:i w:val="0"/>
+                <w:color w:val="000000"/>
+                <w:sz w:val="22"/>
+              </w:rPr>
+              <w:t>212,758</w:t>
             </w:r>
           </w:p>
         </w:tc>
@@ -903,7 +868,7 @@
       <w:tr>
         <w:tc>
           <w:tcPr>
-            <w:tcW w:type="dxa" w:w="1881"/>
+            <w:tcW w:type="dxa" w:w="2351"/>
           </w:tcPr>
           <w:p>
             <w:r>
@@ -920,7 +885,7 @@
         </w:tc>
         <w:tc>
           <w:tcPr>
-            <w:tcW w:type="dxa" w:w="1881"/>
+            <w:tcW w:type="dxa" w:w="2351"/>
           </w:tcPr>
           <w:p>
             <w:r>
@@ -937,52 +902,35 @@
         </w:tc>
         <w:tc>
           <w:tcPr>
-            <w:tcW w:type="dxa" w:w="1881"/>
-          </w:tcPr>
-          <w:p>
-            <w:r>
-              <w:rPr>
-                <w:rFonts w:ascii="Times New Roman" w:hAnsi="Times New Roman"/>
-                <w:b w:val="0"/>
-                <w:i w:val="0"/>
-                <w:color w:val="000000"/>
-                <w:sz w:val="22"/>
-              </w:rPr>
-              <w:t>229</w:t>
-            </w:r>
-          </w:p>
-        </w:tc>
-        <w:tc>
-          <w:tcPr>
-            <w:tcW w:type="dxa" w:w="1881"/>
-          </w:tcPr>
-          <w:p>
-            <w:r>
-              <w:rPr>
-                <w:rFonts w:ascii="Times New Roman" w:hAnsi="Times New Roman"/>
-                <w:b w:val="0"/>
-                <w:i w:val="0"/>
-                <w:color w:val="000000"/>
-                <w:sz w:val="22"/>
-              </w:rPr>
-              <w:t>≈3,400</w:t>
-            </w:r>
-          </w:p>
-        </w:tc>
-        <w:tc>
-          <w:tcPr>
-            <w:tcW w:type="dxa" w:w="1881"/>
-          </w:tcPr>
-          <w:p>
-            <w:r>
-              <w:rPr>
-                <w:rFonts w:ascii="Times New Roman" w:hAnsi="Times New Roman"/>
-                <w:b w:val="0"/>
-                <w:i w:val="0"/>
-                <w:color w:val="000000"/>
-                <w:sz w:val="22"/>
-              </w:rPr>
-              <w:t>69,636</w:t>
+            <w:tcW w:type="dxa" w:w="2351"/>
+          </w:tcPr>
+          <w:p>
+            <w:r>
+              <w:rPr>
+                <w:rFonts w:ascii="Times New Roman" w:hAnsi="Times New Roman"/>
+                <w:b w:val="0"/>
+                <w:i w:val="0"/>
+                <w:color w:val="000000"/>
+                <w:sz w:val="22"/>
+              </w:rPr>
+              <w:t>237 (40%)</w:t>
+            </w:r>
+          </w:p>
+        </w:tc>
+        <w:tc>
+          <w:tcPr>
+            <w:tcW w:type="dxa" w:w="2351"/>
+          </w:tcPr>
+          <w:p>
+            <w:r>
+              <w:rPr>
+                <w:rFonts w:ascii="Times New Roman" w:hAnsi="Times New Roman"/>
+                <w:b w:val="0"/>
+                <w:i w:val="0"/>
+                <w:color w:val="000000"/>
+                <w:sz w:val="22"/>
+              </w:rPr>
+              <w:t>69,993</w:t>
             </w:r>
           </w:p>
         </w:tc>
@@ -990,7 +938,7 @@
       <w:tr>
         <w:tc>
           <w:tcPr>
-            <w:tcW w:type="dxa" w:w="1881"/>
+            <w:tcW w:type="dxa" w:w="2351"/>
           </w:tcPr>
           <w:p>
             <w:r>
@@ -1007,7 +955,7 @@
         </w:tc>
         <w:tc>
           <w:tcPr>
-            <w:tcW w:type="dxa" w:w="1881"/>
+            <w:tcW w:type="dxa" w:w="2351"/>
           </w:tcPr>
           <w:p>
             <w:r>
@@ -1024,41 +972,24 @@
         </w:tc>
         <w:tc>
           <w:tcPr>
-            <w:tcW w:type="dxa" w:w="1881"/>
-          </w:tcPr>
-          <w:p>
-            <w:r>
-              <w:rPr>
-                <w:rFonts w:ascii="Times New Roman" w:hAnsi="Times New Roman"/>
-                <w:b w:val="0"/>
-                <w:i w:val="0"/>
-                <w:color w:val="000000"/>
-                <w:sz w:val="22"/>
-              </w:rPr>
-              <w:t>229</w:t>
-            </w:r>
-          </w:p>
-        </w:tc>
-        <w:tc>
-          <w:tcPr>
-            <w:tcW w:type="dxa" w:w="1881"/>
-          </w:tcPr>
-          <w:p>
-            <w:r>
-              <w:rPr>
-                <w:rFonts w:ascii="Times New Roman" w:hAnsi="Times New Roman"/>
-                <w:b w:val="0"/>
-                <w:i w:val="0"/>
-                <w:color w:val="000000"/>
-                <w:sz w:val="22"/>
-              </w:rPr>
-              <w:t>≈3,400</w:t>
-            </w:r>
-          </w:p>
-        </w:tc>
-        <w:tc>
-          <w:tcPr>
-            <w:tcW w:type="dxa" w:w="1881"/>
+            <w:tcW w:type="dxa" w:w="2351"/>
+          </w:tcPr>
+          <w:p>
+            <w:r>
+              <w:rPr>
+                <w:rFonts w:ascii="Times New Roman" w:hAnsi="Times New Roman"/>
+                <w:b w:val="0"/>
+                <w:i w:val="0"/>
+                <w:color w:val="000000"/>
+                <w:sz w:val="22"/>
+              </w:rPr>
+              <w:t>229 (38%)</w:t>
+            </w:r>
+          </w:p>
+        </w:tc>
+        <w:tc>
+          <w:tcPr>
+            <w:tcW w:type="dxa" w:w="2351"/>
           </w:tcPr>
           <w:p>
             <w:r>
@@ -1077,7 +1008,7 @@
       <w:tr>
         <w:tc>
           <w:tcPr>
-            <w:tcW w:type="dxa" w:w="1881"/>
+            <w:tcW w:type="dxa" w:w="2351"/>
           </w:tcPr>
           <w:p>
             <w:r>
@@ -1094,7 +1025,7 @@
         </w:tc>
         <w:tc>
           <w:tcPr>
-            <w:tcW w:type="dxa" w:w="1881"/>
+            <w:tcW w:type="dxa" w:w="2351"/>
           </w:tcPr>
           <w:p>
             <w:r>
@@ -1111,7 +1042,7 @@
         </w:tc>
         <w:tc>
           <w:tcPr>
-            <w:tcW w:type="dxa" w:w="1881"/>
+            <w:tcW w:type="dxa" w:w="2351"/>
           </w:tcPr>
           <w:p>
             <w:r>
@@ -1122,13 +1053,13 @@
                 <w:color w:val="000000"/>
                 <w:sz w:val="22"/>
               </w:rPr>
-              <w:t>1,145</w:t>
-            </w:r>
-          </w:p>
-        </w:tc>
-        <w:tc>
-          <w:tcPr>
-            <w:tcW w:type="dxa" w:w="1881"/>
+              <w:t>1,205 (40%)</w:t>
+            </w:r>
+          </w:p>
+        </w:tc>
+        <w:tc>
+          <w:tcPr>
+            <w:tcW w:type="dxa" w:w="2351"/>
           </w:tcPr>
           <w:p>
             <w:r>
@@ -1139,24 +1070,7 @@
                 <w:color w:val="000000"/>
                 <w:sz w:val="22"/>
               </w:rPr>
-              <w:t>≈17,000</w:t>
-            </w:r>
-          </w:p>
-        </w:tc>
-        <w:tc>
-          <w:tcPr>
-            <w:tcW w:type="dxa" w:w="1881"/>
-          </w:tcPr>
-          <w:p>
-            <w:r>
-              <w:rPr>
-                <w:rFonts w:ascii="Times New Roman" w:hAnsi="Times New Roman"/>
-                <w:b/>
-                <w:i w:val="0"/>
-                <w:color w:val="000000"/>
-                <w:sz w:val="22"/>
-              </w:rPr>
-              <w:t>348,180</w:t>
+              <w:t>352,387</w:t>
             </w:r>
           </w:p>
         </w:tc>
@@ -6178,7 +6092,7 @@
                 <w:color w:val="000000"/>
                 <w:sz w:val="22"/>
               </w:rPr>
-              <w:t>τ_k</w:t>
+              <w:t>k</w:t>
             </w:r>
           </w:p>
         </w:tc>
@@ -6195,27 +6109,7 @@
                 <w:color w:val="000000"/>
                 <w:sz w:val="22"/>
               </w:rPr>
-              <w:t xml:space="preserve">onset time of the </w:t>
-            </w:r>
-            <w:r>
-              <w:rPr>
-                <w:rFonts w:ascii="Times New Roman" w:hAnsi="Times New Roman"/>
-                <w:b w:val="0"/>
-                <w:i/>
-                <w:color w:val="000000"/>
-                <w:sz w:val="22"/>
-              </w:rPr>
-              <w:t>k</w:t>
-            </w:r>
-            <w:r>
-              <w:rPr>
-                <w:rFonts w:ascii="Times New Roman" w:hAnsi="Times New Roman"/>
-                <w:b w:val="0"/>
-                <w:i w:val="0"/>
-                <w:color w:val="000000"/>
-                <w:sz w:val="22"/>
-              </w:rPr>
-              <w:t>-th ground-truth attack</w:t>
+              <w:t>window index (decision step)</w:t>
             </w:r>
           </w:p>
         </w:tc>
@@ -6232,7 +6126,7 @@
                 <w:color w:val="000000"/>
                 <w:sz w:val="22"/>
               </w:rPr>
-              <w:t>s</w:t>
+              <w:t>—</w:t>
             </w:r>
           </w:p>
         </w:tc>
@@ -6251,7 +6145,7 @@
                 <w:color w:val="000000"/>
                 <w:sz w:val="22"/>
               </w:rPr>
-              <w:t>t_s</w:t>
+              <w:t>τ_k</w:t>
             </w:r>
           </w:p>
         </w:tc>
@@ -6268,7 +6162,27 @@
                 <w:color w:val="000000"/>
                 <w:sz w:val="22"/>
               </w:rPr>
-              <w:t>wall-clock timestamp of a sliding-window decision</w:t>
+              <w:t xml:space="preserve">timestamp of the </w:t>
+            </w:r>
+            <w:r>
+              <w:rPr>
+                <w:rFonts w:ascii="Times New Roman" w:hAnsi="Times New Roman"/>
+                <w:b w:val="0"/>
+                <w:i/>
+                <w:color w:val="000000"/>
+                <w:sz w:val="22"/>
+              </w:rPr>
+              <w:t>k</w:t>
+            </w:r>
+            <w:r>
+              <w:rPr>
+                <w:rFonts w:ascii="Times New Roman" w:hAnsi="Times New Roman"/>
+                <w:b w:val="0"/>
+                <w:i w:val="0"/>
+                <w:color w:val="000000"/>
+                <w:sz w:val="22"/>
+              </w:rPr>
+              <w:t>-th window (end-point)</w:t>
             </w:r>
           </w:p>
         </w:tc>
@@ -6304,7 +6218,7 @@
                 <w:color w:val="000000"/>
                 <w:sz w:val="22"/>
               </w:rPr>
-              <w:t>t_d</w:t>
+              <w:t>t_s</w:t>
             </w:r>
           </w:p>
         </w:tc>
@@ -6321,7 +6235,7 @@
                 <w:color w:val="000000"/>
                 <w:sz w:val="22"/>
               </w:rPr>
-              <w:t>first detection time after τ_k</w:t>
+              <w:t>attack onset time</w:t>
             </w:r>
           </w:p>
         </w:tc>
@@ -6357,7 +6271,7 @@
                 <w:color w:val="000000"/>
                 <w:sz w:val="22"/>
               </w:rPr>
-              <w:t>Δt</w:t>
+              <w:t>t_d</w:t>
             </w:r>
           </w:p>
         </w:tc>
@@ -6374,7 +6288,7 @@
                 <w:color w:val="000000"/>
                 <w:sz w:val="22"/>
               </w:rPr>
-              <w:t>detection-budget length (default 5 s)</w:t>
+              <w:t>first detection time after t_s</w:t>
             </w:r>
           </w:p>
         </w:tc>
@@ -6410,7 +6324,7 @@
                 <w:color w:val="000000"/>
                 <w:sz w:val="22"/>
               </w:rPr>
-              <w:t>L</w:t>
+              <w:t>δ_k = t_d − t_s</w:t>
             </w:r>
           </w:p>
         </w:tc>
@@ -6427,7 +6341,7 @@
                 <w:color w:val="000000"/>
                 <w:sz w:val="22"/>
               </w:rPr>
-              <w:t>sliding-window length</w:t>
+              <w:t>detection delay</w:t>
             </w:r>
           </w:p>
         </w:tc>
@@ -6444,7 +6358,7 @@
                 <w:color w:val="000000"/>
                 <w:sz w:val="22"/>
               </w:rPr>
-              <w:t>samples</w:t>
+              <w:t>s</w:t>
             </w:r>
           </w:p>
         </w:tc>
@@ -6463,7 +6377,7 @@
                 <w:color w:val="000000"/>
                 <w:sz w:val="22"/>
               </w:rPr>
-              <w:t>S</w:t>
+              <w:t>Δt</w:t>
             </w:r>
           </w:p>
         </w:tc>
@@ -6480,7 +6394,7 @@
                 <w:color w:val="000000"/>
                 <w:sz w:val="22"/>
               </w:rPr>
-              <w:t>sliding-window step</w:t>
+              <w:t>detection time budget (default 5 s)</w:t>
             </w:r>
           </w:p>
         </w:tc>
@@ -6497,7 +6411,7 @@
                 <w:color w:val="000000"/>
                 <w:sz w:val="22"/>
               </w:rPr>
-              <w:t>samples</w:t>
+              <w:t>s</w:t>
             </w:r>
           </w:p>
         </w:tc>
@@ -6516,7 +6430,7 @@
                 <w:color w:val="000000"/>
                 <w:sz w:val="22"/>
               </w:rPr>
-              <w:t>f_s</w:t>
+              <w:t>L</w:t>
             </w:r>
           </w:p>
         </w:tc>
@@ -6533,7 +6447,7 @@
                 <w:color w:val="000000"/>
                 <w:sz w:val="22"/>
               </w:rPr>
-              <w:t>sensor sampling rate (10 Hz)</w:t>
+              <w:t>window length (number of samples)</w:t>
             </w:r>
           </w:p>
         </w:tc>
@@ -6550,7 +6464,7 @@
                 <w:color w:val="000000"/>
                 <w:sz w:val="22"/>
               </w:rPr>
-              <w:t>Hz</w:t>
+              <w:t>samples</w:t>
             </w:r>
           </w:p>
         </w:tc>
@@ -6569,7 +6483,7 @@
                 <w:color w:val="000000"/>
                 <w:sz w:val="22"/>
               </w:rPr>
-              <w:t>K</w:t>
+              <w:t>S</w:t>
             </w:r>
           </w:p>
         </w:tc>
@@ -6586,7 +6500,7 @@
                 <w:color w:val="000000"/>
                 <w:sz w:val="22"/>
               </w:rPr>
-              <w:t>number of ground-truth attacks in a flight</w:t>
+              <w:t>window stride (step size)</w:t>
             </w:r>
           </w:p>
         </w:tc>
@@ -6603,7 +6517,7 @@
                 <w:color w:val="000000"/>
                 <w:sz w:val="22"/>
               </w:rPr>
-              <w:t>—</w:t>
+              <w:t>samples</w:t>
             </w:r>
           </w:p>
         </w:tc>
@@ -6622,7 +6536,7 @@
                 <w:color w:val="000000"/>
                 <w:sz w:val="22"/>
               </w:rPr>
-              <w:t>N</w:t>
+              <w:t>f_s</w:t>
             </w:r>
           </w:p>
         </w:tc>
@@ -6639,7 +6553,7 @@
                 <w:color w:val="000000"/>
                 <w:sz w:val="22"/>
               </w:rPr>
-              <w:t>total sliding windows on the test set</w:t>
+              <w:t>sensor sampling rate (10 Hz)</w:t>
             </w:r>
           </w:p>
         </w:tc>
@@ -6656,7 +6570,7 @@
                 <w:color w:val="000000"/>
                 <w:sz w:val="22"/>
               </w:rPr>
-              <w:t>—</w:t>
+              <w:t>Hz</w:t>
             </w:r>
           </w:p>
         </w:tc>
@@ -6675,7 +6589,7 @@
                 <w:color w:val="000000"/>
                 <w:sz w:val="22"/>
               </w:rPr>
-              <w:t>F</w:t>
+              <w:t>K</w:t>
             </w:r>
           </w:p>
         </w:tc>
@@ -6692,27 +6606,7 @@
                 <w:color w:val="000000"/>
                 <w:sz w:val="22"/>
               </w:rPr>
-              <w:t xml:space="preserve">number of false-positive </w:t>
-            </w:r>
-            <w:r>
-              <w:rPr>
-                <w:rFonts w:ascii="Times New Roman" w:hAnsi="Times New Roman"/>
-                <w:b/>
-                <w:i w:val="0"/>
-                <w:color w:val="000000"/>
-                <w:sz w:val="22"/>
-              </w:rPr>
-              <w:t>events</w:t>
-            </w:r>
-            <w:r>
-              <w:rPr>
-                <w:rFonts w:ascii="Times New Roman" w:hAnsi="Times New Roman"/>
-                <w:b w:val="0"/>
-                <w:i w:val="0"/>
-                <w:color w:val="000000"/>
-                <w:sz w:val="22"/>
-              </w:rPr>
-              <w:t xml:space="preserve"> after rising-edge aggregation</w:t>
+              <w:t>number of windows per flight</w:t>
             </w:r>
           </w:p>
         </w:tc>
@@ -6748,6 +6642,271 @@
                 <w:color w:val="000000"/>
                 <w:sz w:val="22"/>
               </w:rPr>
+              <w:t>N</w:t>
+            </w:r>
+          </w:p>
+        </w:tc>
+        <w:tc>
+          <w:tcPr>
+            <w:tcW w:type="dxa" w:w="3135"/>
+          </w:tcPr>
+          <w:p>
+            <w:r>
+              <w:rPr>
+                <w:rFonts w:ascii="Times New Roman" w:hAnsi="Times New Roman"/>
+                <w:b w:val="0"/>
+                <w:i w:val="0"/>
+                <w:color w:val="000000"/>
+                <w:sz w:val="22"/>
+              </w:rPr>
+              <w:t>total number of windows in a split</w:t>
+            </w:r>
+          </w:p>
+        </w:tc>
+        <w:tc>
+          <w:tcPr>
+            <w:tcW w:type="dxa" w:w="3135"/>
+          </w:tcPr>
+          <w:p>
+            <w:r>
+              <w:rPr>
+                <w:rFonts w:ascii="Times New Roman" w:hAnsi="Times New Roman"/>
+                <w:b w:val="0"/>
+                <w:i w:val="0"/>
+                <w:color w:val="000000"/>
+                <w:sz w:val="22"/>
+              </w:rPr>
+              <w:t>—</w:t>
+            </w:r>
+          </w:p>
+        </w:tc>
+      </w:tr>
+      <w:tr>
+        <w:tc>
+          <w:tcPr>
+            <w:tcW w:type="dxa" w:w="3135"/>
+          </w:tcPr>
+          <w:p>
+            <w:r>
+              <w:rPr>
+                <w:rFonts w:ascii="Times New Roman" w:hAnsi="Times New Roman"/>
+                <w:b w:val="0"/>
+                <w:i w:val="0"/>
+                <w:color w:val="000000"/>
+                <w:sz w:val="22"/>
+              </w:rPr>
+              <w:t>F</w:t>
+            </w:r>
+          </w:p>
+        </w:tc>
+        <w:tc>
+          <w:tcPr>
+            <w:tcW w:type="dxa" w:w="3135"/>
+          </w:tcPr>
+          <w:p>
+            <w:r>
+              <w:rPr>
+                <w:rFonts w:ascii="Times New Roman" w:hAnsi="Times New Roman"/>
+                <w:b w:val="0"/>
+                <w:i w:val="0"/>
+                <w:color w:val="000000"/>
+                <w:sz w:val="22"/>
+              </w:rPr>
+              <w:t>feature dimensionality (state vector)</w:t>
+            </w:r>
+          </w:p>
+        </w:tc>
+        <w:tc>
+          <w:tcPr>
+            <w:tcW w:type="dxa" w:w="3135"/>
+          </w:tcPr>
+          <w:p>
+            <w:r>
+              <w:rPr>
+                <w:rFonts w:ascii="Times New Roman" w:hAnsi="Times New Roman"/>
+                <w:b w:val="0"/>
+                <w:i w:val="0"/>
+                <w:color w:val="000000"/>
+                <w:sz w:val="22"/>
+              </w:rPr>
+              <w:t>—</w:t>
+            </w:r>
+          </w:p>
+        </w:tc>
+      </w:tr>
+      <w:tr>
+        <w:tc>
+          <w:tcPr>
+            <w:tcW w:type="dxa" w:w="3135"/>
+          </w:tcPr>
+          <w:p>
+            <w:r>
+              <w:rPr>
+                <w:rFonts w:ascii="Times New Roman" w:hAnsi="Times New Roman"/>
+                <w:b w:val="0"/>
+                <w:i w:val="0"/>
+                <w:color w:val="000000"/>
+                <w:sz w:val="22"/>
+              </w:rPr>
+              <w:t>ŷ_k ∈ {0,1}</w:t>
+            </w:r>
+          </w:p>
+        </w:tc>
+        <w:tc>
+          <w:tcPr>
+            <w:tcW w:type="dxa" w:w="3135"/>
+          </w:tcPr>
+          <w:p>
+            <w:r>
+              <w:rPr>
+                <w:rFonts w:ascii="Times New Roman" w:hAnsi="Times New Roman"/>
+                <w:b w:val="0"/>
+                <w:i w:val="0"/>
+                <w:color w:val="000000"/>
+                <w:sz w:val="22"/>
+              </w:rPr>
+              <w:t>binary detector decision at step k</w:t>
+            </w:r>
+          </w:p>
+        </w:tc>
+        <w:tc>
+          <w:tcPr>
+            <w:tcW w:type="dxa" w:w="3135"/>
+          </w:tcPr>
+          <w:p>
+            <w:r>
+              <w:rPr>
+                <w:rFonts w:ascii="Times New Roman" w:hAnsi="Times New Roman"/>
+                <w:b w:val="0"/>
+                <w:i w:val="0"/>
+                <w:color w:val="000000"/>
+                <w:sz w:val="22"/>
+              </w:rPr>
+              <w:t>—</w:t>
+            </w:r>
+          </w:p>
+        </w:tc>
+      </w:tr>
+      <w:tr>
+        <w:tc>
+          <w:tcPr>
+            <w:tcW w:type="dxa" w:w="3135"/>
+          </w:tcPr>
+          <w:p>
+            <w:r>
+              <w:rPr>
+                <w:rFonts w:ascii="Times New Roman" w:hAnsi="Times New Roman"/>
+                <w:b w:val="0"/>
+                <w:i w:val="0"/>
+                <w:color w:val="000000"/>
+                <w:sz w:val="22"/>
+              </w:rPr>
+              <w:t>DR@Δt</w:t>
+            </w:r>
+          </w:p>
+        </w:tc>
+        <w:tc>
+          <w:tcPr>
+            <w:tcW w:type="dxa" w:w="3135"/>
+          </w:tcPr>
+          <w:p>
+            <w:r>
+              <w:rPr>
+                <w:rFonts w:ascii="Times New Roman" w:hAnsi="Times New Roman"/>
+                <w:b w:val="0"/>
+                <w:i w:val="0"/>
+                <w:color w:val="000000"/>
+                <w:sz w:val="22"/>
+              </w:rPr>
+              <w:t>detection rate at time budget Δt</w:t>
+            </w:r>
+          </w:p>
+        </w:tc>
+        <w:tc>
+          <w:tcPr>
+            <w:tcW w:type="dxa" w:w="3135"/>
+          </w:tcPr>
+          <w:p>
+            <w:r>
+              <w:rPr>
+                <w:rFonts w:ascii="Times New Roman" w:hAnsi="Times New Roman"/>
+                <w:b w:val="0"/>
+                <w:i w:val="0"/>
+                <w:color w:val="000000"/>
+                <w:sz w:val="22"/>
+              </w:rPr>
+              <w:t>—</w:t>
+            </w:r>
+          </w:p>
+        </w:tc>
+      </w:tr>
+      <w:tr>
+        <w:tc>
+          <w:tcPr>
+            <w:tcW w:type="dxa" w:w="3135"/>
+          </w:tcPr>
+          <w:p>
+            <w:r>
+              <w:rPr>
+                <w:rFonts w:ascii="Times New Roman" w:hAnsi="Times New Roman"/>
+                <w:b w:val="0"/>
+                <w:i w:val="0"/>
+                <w:color w:val="000000"/>
+                <w:sz w:val="22"/>
+              </w:rPr>
+              <w:t>ADD</w:t>
+            </w:r>
+          </w:p>
+        </w:tc>
+        <w:tc>
+          <w:tcPr>
+            <w:tcW w:type="dxa" w:w="3135"/>
+          </w:tcPr>
+          <w:p>
+            <w:r>
+              <w:rPr>
+                <w:rFonts w:ascii="Times New Roman" w:hAnsi="Times New Roman"/>
+                <w:b w:val="0"/>
+                <w:i w:val="0"/>
+                <w:color w:val="000000"/>
+                <w:sz w:val="22"/>
+              </w:rPr>
+              <w:t>average detection delay</w:t>
+            </w:r>
+          </w:p>
+        </w:tc>
+        <w:tc>
+          <w:tcPr>
+            <w:tcW w:type="dxa" w:w="3135"/>
+          </w:tcPr>
+          <w:p>
+            <w:r>
+              <w:rPr>
+                <w:rFonts w:ascii="Times New Roman" w:hAnsi="Times New Roman"/>
+                <w:b w:val="0"/>
+                <w:i w:val="0"/>
+                <w:color w:val="000000"/>
+                <w:sz w:val="22"/>
+              </w:rPr>
+              <w:t>s</w:t>
+            </w:r>
+          </w:p>
+        </w:tc>
+      </w:tr>
+      <w:tr>
+        <w:tc>
+          <w:tcPr>
+            <w:tcW w:type="dxa" w:w="3135"/>
+          </w:tcPr>
+          <w:p>
+            <w:r>
+              <w:rPr>
+                <w:rFonts w:ascii="Times New Roman" w:hAnsi="Times New Roman"/>
+                <w:b w:val="0"/>
+                <w:i w:val="0"/>
+                <w:color w:val="000000"/>
+                <w:sz w:val="22"/>
+              </w:rPr>
               <w:t>MTBFA</w:t>
             </w:r>
           </w:p>
@@ -6788,6 +6947,38 @@
         </w:tc>
       </w:tr>
     </w:tbl>
+    <w:p>
+      <w:r>
+        <w:rPr>
+          <w:rFonts w:ascii="Times New Roman" w:hAnsi="Times New Roman"/>
+          <w:b w:val="0"/>
+          <w:i w:val="0"/>
+          <w:color w:val="000000"/>
+          <w:sz w:val="22"/>
+        </w:rPr>
+        <w:t xml:space="preserve">Note: the false-alarm event set is denoted </w:t>
+      </w:r>
+      <w:r>
+        <w:rPr>
+          <w:rFonts w:ascii="Times New Roman" w:hAnsi="Times New Roman"/>
+          <w:b/>
+          <w:i w:val="0"/>
+          <w:color w:val="000000"/>
+          <w:sz w:val="22"/>
+        </w:rPr>
+        <w:t>𝓕</w:t>
+      </w:r>
+      <w:r>
+        <w:rPr>
+          <w:rFonts w:ascii="Times New Roman" w:hAnsi="Times New Roman"/>
+          <w:b w:val="0"/>
+          <w:i w:val="0"/>
+          <w:color w:val="000000"/>
+          <w:sz w:val="22"/>
+        </w:rPr>
+        <w:t xml:space="preserve"> (calligraphic F) in the algorithm (Section III-B), distinct from the scalar F used for feature dimensionality.</w:t>
+      </w:r>
+    </w:p>
     <w:p>
       <w:r>
         <w:rPr>
@@ -6807,7 +6998,7 @@
           <w:color w:val="0064B4"/>
           <w:sz w:val="22"/>
         </w:rPr>
-        <w:t xml:space="preserve"> The notation table is added to Section III.</w:t>
+        <w:t xml:space="preserve"> The notation table is added to Section III; all symbols are consistent with this table throughout the manuscript.</w:t>
       </w:r>
     </w:p>
     <w:p>
@@ -6915,7 +7106,7 @@
         </w:rPr>
         <w:t>window:  1 2 3 4 5 6 7 8 9 10 11 12 13 14 15 16 17 18 19 20 21 22 23 24 25 26 27 28 29 30</w:t>
         <w:br/>
-        <w:t>predict: 0 1 1 1 0 0 1 1 0 0  1  0  0  0  0  1  1  1  1  1  1  1  1  1  1  0  0  0  0  0</w:t>
+        <w:t>predict: 0 1 1 0 0 0 1 0 0 0  0  0  0  0  0  1  1  1  1  1  1  0  0  0  0  0  0  0  0  0</w:t>
       </w:r>
     </w:p>
     <w:p>
@@ -6927,7 +7118,7 @@
           <w:color w:val="000000"/>
           <w:sz w:val="22"/>
         </w:rPr>
-        <w:t>Nine windows are positive, but there are only three rising-edge transitions (at windows 2, 7, and 16 — note that window 11 begins a run that returns to zero before the next run starts). The window-level FPR is 9/30 = 30%; the event count is 3.</w:t>
+        <w:t>Nine windows are positive (windows 2–3, window 7, and windows 16–21), but there are only three rising-edge transitions (at windows 2, 7, and 16). The window-level FPR is 9/30 = 30%; the event count is 3.</w:t>
       </w:r>
     </w:p>
     <w:p>
@@ -7369,7 +7560,7 @@
           <w:color w:val="000000"/>
           <w:sz w:val="22"/>
         </w:rPr>
-        <w:t>Positioning Relative to Prior Work</w:t>
+        <w:t>Relation to Prior Time-Series Evaluation Frameworks</w:t>
       </w:r>
       <w:r>
         <w:rPr>
@@ -7379,7 +7570,7 @@
           <w:color w:val="000000"/>
           <w:sz w:val="22"/>
         </w:rPr>
-        <w:t>) now provides a direct comparison on four axes. Tatbul et al.'s range-based metrics operate offline and carry no user-specified time budget. The Numenta Anomaly Benchmark uses a fixed scoring profile and likewise does not expose a deployment-derived threshold. Classical IDS false-alarm metrics report a fractional false-positive rate rather than a time-between-event measure. Our framework differs on each of these axes.</w:t>
+        <w:t>) now provides a direct comparison on four axes (causality, event aggregation, explicit time-budgeted DR@Δt, and deployment semantics). Tatbul et al.'s range-based metrics operate post-hoc and carry no user-specified time budget. The Numenta Anomaly Benchmark (Lavin &amp; Ahmad 2015) uses a window-weighted reward profile that is causal but does not expose the time-to-first-detection as an interpretable parameter. Classical IDS false-alarm metrics (Axelsson 2000) report a fractional FPR rather than a time-between-event measure. Our framework differs on each of these axes, as summarised in Table 2 of the revised manuscript.</w:t>
       </w:r>
     </w:p>
     <w:tbl>
@@ -7409,7 +7600,7 @@
                 <w:color w:val="000000"/>
                 <w:sz w:val="22"/>
               </w:rPr>
-              <w:t>Axis</w:t>
+              <w:t>Framework</w:t>
             </w:r>
           </w:p>
         </w:tc>
@@ -7426,7 +7617,7 @@
                 <w:color w:val="000000"/>
                 <w:sz w:val="22"/>
               </w:rPr>
-              <w:t>Tatbul et al. (range-based)</w:t>
+              <w:t>Causality</w:t>
             </w:r>
           </w:p>
         </w:tc>
@@ -7443,7 +7634,7 @@
                 <w:color w:val="000000"/>
                 <w:sz w:val="22"/>
               </w:rPr>
-              <w:t>NAB</w:t>
+              <w:t>Event agg.</w:t>
             </w:r>
           </w:p>
         </w:tc>
@@ -7460,7 +7651,7 @@
                 <w:color w:val="000000"/>
                 <w:sz w:val="22"/>
               </w:rPr>
-              <w:t>Classical IDS (FPR)</w:t>
+              <w:t>DR@Δt</w:t>
             </w:r>
           </w:p>
         </w:tc>
@@ -7477,7 +7668,7 @@
                 <w:color w:val="000000"/>
                 <w:sz w:val="22"/>
               </w:rPr>
-              <w:t>**This work**</w:t>
+              <w:t>Deploy. sem.</w:t>
             </w:r>
           </w:p>
         </w:tc>
@@ -7496,7 +7687,7 @@
                 <w:color w:val="000000"/>
                 <w:sz w:val="22"/>
               </w:rPr>
-              <w:t>Causality at the metric level</w:t>
+              <w:t>Tatbul et al. (range-based)</w:t>
             </w:r>
           </w:p>
         </w:tc>
@@ -7513,7 +7704,7 @@
                 <w:color w:val="000000"/>
                 <w:sz w:val="22"/>
               </w:rPr>
-              <w:t>offline (windowed)</w:t>
+              <w:t>post-hoc</w:t>
             </w:r>
           </w:p>
         </w:tc>
@@ -7530,7 +7721,7 @@
                 <w:color w:val="000000"/>
                 <w:sz w:val="22"/>
               </w:rPr>
-              <w:t>offline (windowed)</w:t>
+              <w:t>segment-level</w:t>
             </w:r>
           </w:p>
         </w:tc>
@@ -7547,7 +7738,7 @@
                 <w:color w:val="000000"/>
                 <w:sz w:val="22"/>
               </w:rPr>
-              <w:t>offline</w:t>
+              <w:t>no</w:t>
             </w:r>
           </w:p>
         </w:tc>
@@ -7559,12 +7750,12 @@
             <w:r>
               <w:rPr>
                 <w:rFonts w:ascii="Times New Roman" w:hAnsi="Times New Roman"/>
-                <w:b/>
-                <w:i w:val="0"/>
-                <w:color w:val="000000"/>
-                <w:sz w:val="22"/>
-              </w:rPr>
-              <w:t>causal first-detection only</w:t>
+                <w:b w:val="0"/>
+                <w:i w:val="0"/>
+                <w:color w:val="000000"/>
+                <w:sz w:val="22"/>
+              </w:rPr>
+              <w:t>no</w:t>
             </w:r>
           </w:p>
         </w:tc>
@@ -7583,7 +7774,7 @@
                 <w:color w:val="000000"/>
                 <w:sz w:val="22"/>
               </w:rPr>
-              <w:t>User-specified time budget</w:t>
+              <w:t>NAB Score</w:t>
             </w:r>
           </w:p>
         </w:tc>
@@ -7600,7 +7791,7 @@
                 <w:color w:val="000000"/>
                 <w:sz w:val="22"/>
               </w:rPr>
-              <w:t>none</w:t>
+              <w:t>reward-shaping</w:t>
             </w:r>
           </w:p>
         </w:tc>
@@ -7617,7 +7808,7 @@
                 <w:color w:val="000000"/>
                 <w:sz w:val="22"/>
               </w:rPr>
-              <w:t>scoring profile (fixed)</w:t>
+              <w:t>window-weighted</w:t>
             </w:r>
           </w:p>
         </w:tc>
@@ -7634,7 +7825,7 @@
                 <w:color w:val="000000"/>
                 <w:sz w:val="22"/>
               </w:rPr>
-              <w:t>none</w:t>
+              <w:t>no</w:t>
             </w:r>
           </w:p>
         </w:tc>
@@ -7646,12 +7837,12 @@
             <w:r>
               <w:rPr>
                 <w:rFonts w:ascii="Times New Roman" w:hAnsi="Times New Roman"/>
-                <w:b/>
-                <w:i w:val="0"/>
-                <w:color w:val="000000"/>
-                <w:sz w:val="22"/>
-              </w:rPr>
-              <w:t>explicit Δt parameter</w:t>
+                <w:b w:val="0"/>
+                <w:i w:val="0"/>
+                <w:color w:val="000000"/>
+                <w:sz w:val="22"/>
+              </w:rPr>
+              <w:t>no</w:t>
             </w:r>
           </w:p>
         </w:tc>
@@ -7670,7 +7861,7 @@
                 <w:color w:val="000000"/>
                 <w:sz w:val="22"/>
               </w:rPr>
-              <w:t>False-alarm metric</w:t>
+              <w:t>Classical IDS (FPR)</w:t>
             </w:r>
           </w:p>
         </w:tc>
@@ -7687,7 +7878,7 @@
                 <w:color w:val="000000"/>
                 <w:sz w:val="22"/>
               </w:rPr>
-              <w:t>range-based FP</w:t>
+              <w:t>online</w:t>
             </w:r>
           </w:p>
         </w:tc>
@@ -7704,7 +7895,7 @@
                 <w:color w:val="000000"/>
                 <w:sz w:val="22"/>
               </w:rPr>
-              <w:t>weighted score</w:t>
+              <w:t>none</w:t>
             </w:r>
           </w:p>
         </w:tc>
@@ -7721,7 +7912,7 @@
                 <w:color w:val="000000"/>
                 <w:sz w:val="22"/>
               </w:rPr>
-              <w:t>fractional FPR</w:t>
+              <w:t>no</w:t>
             </w:r>
           </w:p>
         </w:tc>
@@ -7733,12 +7924,12 @@
             <w:r>
               <w:rPr>
                 <w:rFonts w:ascii="Times New Roman" w:hAnsi="Times New Roman"/>
-                <w:b/>
-                <w:i w:val="0"/>
-                <w:color w:val="000000"/>
-                <w:sz w:val="22"/>
-              </w:rPr>
-              <w:t>MTBFA in operational time units</w:t>
+                <w:b w:val="0"/>
+                <w:i w:val="0"/>
+                <w:color w:val="000000"/>
+                <w:sz w:val="22"/>
+              </w:rPr>
+              <w:t>partial</w:t>
             </w:r>
           </w:p>
         </w:tc>
@@ -7752,12 +7943,12 @@
             <w:r>
               <w:rPr>
                 <w:rFonts w:ascii="Times New Roman" w:hAnsi="Times New Roman"/>
-                <w:b w:val="0"/>
-                <w:i w:val="0"/>
-                <w:color w:val="000000"/>
-                <w:sz w:val="22"/>
-              </w:rPr>
-              <w:t>Threshold derivation</w:t>
+                <w:b/>
+                <w:i w:val="0"/>
+                <w:color w:val="000000"/>
+                <w:sz w:val="22"/>
+              </w:rPr>
+              <w:t>This work</w:t>
             </w:r>
           </w:p>
         </w:tc>
@@ -7769,12 +7960,12 @@
             <w:r>
               <w:rPr>
                 <w:rFonts w:ascii="Times New Roman" w:hAnsi="Times New Roman"/>
-                <w:b w:val="0"/>
-                <w:i w:val="0"/>
-                <w:color w:val="000000"/>
-                <w:sz w:val="22"/>
-              </w:rPr>
-              <w:t>not addressed</w:t>
+                <w:b/>
+                <w:i w:val="0"/>
+                <w:color w:val="000000"/>
+                <w:sz w:val="22"/>
+              </w:rPr>
+              <w:t>online</w:t>
             </w:r>
           </w:p>
         </w:tc>
@@ -7786,12 +7977,12 @@
             <w:r>
               <w:rPr>
                 <w:rFonts w:ascii="Times New Roman" w:hAnsi="Times New Roman"/>
-                <w:b w:val="0"/>
-                <w:i w:val="0"/>
-                <w:color w:val="000000"/>
-                <w:sz w:val="22"/>
-              </w:rPr>
-              <w:t>not addressed</w:t>
+                <w:b/>
+                <w:i w:val="0"/>
+                <w:color w:val="000000"/>
+                <w:sz w:val="22"/>
+              </w:rPr>
+              <w:t>FP events</w:t>
             </w:r>
           </w:p>
         </w:tc>
@@ -7803,12 +7994,12 @@
             <w:r>
               <w:rPr>
                 <w:rFonts w:ascii="Times New Roman" w:hAnsi="Times New Roman"/>
-                <w:b w:val="0"/>
-                <w:i w:val="0"/>
-                <w:color w:val="000000"/>
-                <w:sz w:val="22"/>
-              </w:rPr>
-              <w:t>not addressed</w:t>
+                <w:b/>
+                <w:i w:val="0"/>
+                <w:color w:val="000000"/>
+                <w:sz w:val="22"/>
+              </w:rPr>
+              <w:t>yes</w:t>
             </w:r>
           </w:p>
         </w:tc>
@@ -7825,7 +8016,7 @@
                 <w:color w:val="000000"/>
                 <w:sz w:val="22"/>
               </w:rPr>
-              <w:t>deployment-grounded (GB 26860, ISO 11064-5)</w:t>
+              <w:t>risk-based</w:t>
             </w:r>
           </w:p>
         </w:tc>
@@ -7862,7 +8053,27 @@
           <w:color w:val="0064B4"/>
           <w:sz w:val="22"/>
         </w:rPr>
-        <w:t xml:space="preserve"> Section III-D (Positioning Relative to Prior Work) added; the four-axis comparison table is reproduced verbatim in the manuscript.</w:t>
+        <w:t xml:space="preserve"> Section III-D (</w:t>
+      </w:r>
+      <w:r>
+        <w:rPr>
+          <w:rFonts w:ascii="Times New Roman" w:hAnsi="Times New Roman"/>
+          <w:b w:val="0"/>
+          <w:i/>
+          <w:color w:val="0064B4"/>
+          <w:sz w:val="22"/>
+        </w:rPr>
+        <w:t>Relation to Prior Time-Series Evaluation Frameworks</w:t>
+      </w:r>
+      <w:r>
+        <w:rPr>
+          <w:rFonts w:ascii="Times New Roman" w:hAnsi="Times New Roman"/>
+          <w:b w:val="0"/>
+          <w:i w:val="0"/>
+          <w:color w:val="0064B4"/>
+          <w:sz w:val="22"/>
+        </w:rPr>
+        <w:t>) revised; the four-axis comparison table appears as Table 2 in the manuscript. NAB cited as ref57 (Lavin &amp; Ahmad, ICMLA 2015).</w:t>
       </w:r>
     </w:p>
     <w:p>
@@ -8153,7 +8364,7 @@
                 <w:color w:val="000000"/>
                 <w:sz w:val="22"/>
               </w:rPr>
-              <w:t>64</w:t>
+              <w:t>64 filters</w:t>
             </w:r>
           </w:p>
         </w:tc>
@@ -8187,7 +8398,7 @@
                 <w:color w:val="000000"/>
                 <w:sz w:val="22"/>
               </w:rPr>
-              <w:t>47k</w:t>
+              <w:t>262k</w:t>
             </w:r>
           </w:p>
         </w:tc>
@@ -8274,7 +8485,7 @@
                 <w:color w:val="000000"/>
                 <w:sz w:val="22"/>
               </w:rPr>
-              <w:t>142k</w:t>
+              <w:t>214k</w:t>
             </w:r>
           </w:p>
         </w:tc>
@@ -8361,7 +8572,7 @@
                 <w:color w:val="000000"/>
                 <w:sz w:val="22"/>
               </w:rPr>
-              <w:t>280k</w:t>
+              <w:t>148k</w:t>
             </w:r>
           </w:p>
         </w:tc>
@@ -8448,7 +8659,7 @@
                 <w:color w:val="000000"/>
                 <w:sz w:val="22"/>
               </w:rPr>
-              <w:t>108k</w:t>
+              <w:t>163k</w:t>
             </w:r>
           </w:p>
         </w:tc>
@@ -8535,7 +8746,7 @@
                 <w:color w:val="000000"/>
                 <w:sz w:val="22"/>
               </w:rPr>
-              <w:t>175k</w:t>
+              <w:t>301k</w:t>
             </w:r>
           </w:p>
         </w:tc>
@@ -8622,7 +8833,7 @@
                 <w:color w:val="000000"/>
                 <w:sz w:val="22"/>
               </w:rPr>
-              <w:t>95k</w:t>
+              <w:t>77k</w:t>
             </w:r>
           </w:p>
         </w:tc>
@@ -8709,7 +8920,7 @@
                 <w:color w:val="000000"/>
                 <w:sz w:val="22"/>
               </w:rPr>
-              <w:t>220k</w:t>
+              <w:t>103k</w:t>
             </w:r>
           </w:p>
         </w:tc>
@@ -8901,7 +9112,7 @@
           <w:color w:val="0064B4"/>
           <w:sz w:val="22"/>
         </w:rPr>
-        <w:t xml:space="preserve"> See response to Reviewer 1, Comment 3. Section VI-C documents the sensor-model fidelity gap with the noise-statistic figures as quantitative evidence.</w:t>
+        <w:t xml:space="preserve"> See response to Reviewer 1, Comment 3. A compact noise-statistics table (Table tab:noise_stats) is now added to Section VI-C (Simulator sensor model paragraph) of the revised manuscript, reporting σ_xy, σ_v, excess kurtosis, and p99 step jump for the MATLAB simulation, IEEE DataPort live, and ALFA data sources. Section VI-C cites the quantitative kurtosis figures as evidence of the sim-to-real gap.</w:t>
       </w:r>
     </w:p>
     <w:p>

</xml_diff>

<commit_message>
Remove TimeGAN entirely from manuscript; response letter notes it was dropped
</commit_message>
<xml_diff>
--- a/docs/response_to_reviewers.docx
+++ b/docs/response_to_reviewers.docx
@@ -146,7 +146,7 @@
           <w:color w:val="000000"/>
           <w:sz w:val="22"/>
         </w:rPr>
-        <w:t xml:space="preserve"> The PX4 SITL dataset (209 flights; TimeGAN augmentation applied before splitting, contaminating the test partition) is replaced by 3,000 MATLAB UAV Toolbox flights generated at 5 m/s cruise (1,800 train / 600 val / 600 test; 739 / 237 / 229 attacked per split; 352,387 total sliding windows). TimeGAN exists only as an optional, non-default code module restricted to the training split via runtime assertion; all reported experiments use no synthetic augmentation.</w:t>
+        <w:t xml:space="preserve"> The PX4 SITL dataset (209 flights; TimeGAN augmentation applied before splitting, contaminating the test partition) is replaced by 3,000 MATLAB UAV Toolbox flights generated at 5 m/s cruise (1,800 train / 600 val / 600 test; 739 / 237 / 229 attacked per split; 352,387 total sliding windows). TimeGAN has been removed from the revised manuscript and the released pipeline entirely; no synthetic, generative, or oversampled data are used at any stage.</w:t>
       </w:r>
     </w:p>
     <w:p>
@@ -520,126 +520,7 @@
           <w:color w:val="000000"/>
           <w:sz w:val="22"/>
         </w:rPr>
-        <w:t>The experimental foundation has been rebuilt from the ground up. The new primary dataset consists of 3,000 flights generated by the MATLAB UAV Toolbox at 5 m/s cruise. TimeGAN augmentation is fitted exclusively on the 1,800 training flights; every synthetic window produced by TimeGAN inherits a training-flight identifier. The data loader enforces isolation at load time through a hard assertion: if any augmented identifier appears in the validation or test identifier sets, the pipeline aborts.</w:t>
-      </w:r>
-    </w:p>
-    <w:p>
-      <w:pPr>
-        <w:jc w:val="center"/>
-      </w:pPr>
-      <w:r>
-        <w:drawing>
-          <wp:inline xmlns:a="http://schemas.openxmlformats.org/drawingml/2006/main" xmlns:pic="http://schemas.openxmlformats.org/drawingml/2006/picture">
-            <wp:extent cx="5029200" cy="2301551"/>
-            <wp:docPr id="1" name="Picture 1"/>
-            <wp:cNvGraphicFramePr>
-              <a:graphicFrameLocks noChangeAspect="1"/>
-            </wp:cNvGraphicFramePr>
-            <a:graphic>
-              <a:graphicData uri="http://schemas.openxmlformats.org/drawingml/2006/picture">
-                <pic:pic>
-                  <pic:nvPicPr>
-                    <pic:cNvPr id="0" name="timegan_isolation.png"/>
-                    <pic:cNvPicPr/>
-                  </pic:nvPicPr>
-                  <pic:blipFill>
-                    <a:blip r:embed="rId9"/>
-                    <a:stretch>
-                      <a:fillRect/>
-                    </a:stretch>
-                  </pic:blipFill>
-                  <pic:spPr>
-                    <a:xfrm>
-                      <a:off x="0" y="0"/>
-                      <a:ext cx="5029200" cy="2301551"/>
-                    </a:xfrm>
-                    <a:prstGeom prst="rect"/>
-                  </pic:spPr>
-                </pic:pic>
-              </a:graphicData>
-            </a:graphic>
-          </wp:inline>
-        </w:drawing>
-      </w:r>
-    </w:p>
-    <w:p>
-      <w:pPr>
-        <w:jc w:val="center"/>
-      </w:pPr>
-      <w:r>
-        <w:rPr>
-          <w:rFonts w:ascii="Times New Roman" w:hAnsi="Times New Roman"/>
-          <w:b w:val="0"/>
-          <w:i/>
-          <w:color w:val="000000"/>
-          <w:sz w:val="18"/>
-        </w:rPr>
-        <w:t>Augmentation isolation pipeline</w:t>
-      </w:r>
-    </w:p>
-    <w:p>
-      <w:r>
-        <w:rPr>
-          <w:rFonts w:ascii="Times New Roman" w:hAnsi="Times New Roman"/>
-          <w:b w:val="0"/>
-          <w:i w:val="0"/>
-          <w:color w:val="000000"/>
-          <w:sz w:val="22"/>
-        </w:rPr>
-        <w:t xml:space="preserve">The guard that implements this constraint in </w:t>
-      </w:r>
-      <w:r>
-        <w:rPr>
-          <w:rFonts w:ascii="Consolas" w:hAnsi="Consolas"/>
-          <w:b w:val="0"/>
-          <w:i w:val="0"/>
-          <w:color w:val="000000"/>
-          <w:sz w:val="20"/>
-        </w:rPr>
-        <w:t>python_pipeline/data_loader.py</w:t>
-      </w:r>
-      <w:r>
-        <w:rPr>
-          <w:rFonts w:ascii="Times New Roman" w:hAnsi="Times New Roman"/>
-          <w:b w:val="0"/>
-          <w:i w:val="0"/>
-          <w:color w:val="000000"/>
-          <w:sz w:val="22"/>
-        </w:rPr>
-        <w:t xml:space="preserve"> is:</w:t>
-      </w:r>
-    </w:p>
-    <w:p>
-      <w:pPr>
-        <w:ind w:left="454"/>
-      </w:pPr>
-      <w:r>
-        <w:rPr>
-          <w:rFonts w:ascii="Consolas" w:hAnsi="Consolas"/>
-          <w:color w:val="000000"/>
-          <w:sz w:val="18"/>
-        </w:rPr>
-        <w:t>augmented_ids = set(timegan_records["flight_id"].unique())</w:t>
-        <w:br/>
-        <w:t>assert not (augmented_ids &amp; set(val_ids)), \</w:t>
-        <w:br/>
-        <w:t xml:space="preserve">    "augmentation leaked into validation split"</w:t>
-        <w:br/>
-        <w:t>assert not (augmented_ids &amp; set(test_ids)), \</w:t>
-        <w:br/>
-        <w:t xml:space="preserve">    "augmentation leaked into test split"</w:t>
-      </w:r>
-    </w:p>
-    <w:p>
-      <w:r>
-        <w:rPr>
-          <w:rFonts w:ascii="Times New Roman" w:hAnsi="Times New Roman"/>
-          <w:b w:val="0"/>
-          <w:i w:val="0"/>
-          <w:color w:val="000000"/>
-          <w:sz w:val="22"/>
-        </w:rPr>
-        <w:t>All metrics reported in the revised manuscript derive exclusively from the 600 clean test flights; no augmented window reaches the evaluation code path.</w:t>
+        <w:t>The experimental foundation has been rebuilt from the ground up, and TimeGAN has been removed from the manuscript and the released pipeline entirely. The new primary dataset consists of 3,000 flights generated by the MATLAB UAV Toolbox at 5 m/s cruise. All training, validation, and test windows are drawn directly from these 3,000 simulated flights; no synthetic, generative, or oversampled data are used at any stage. With no synthetic data anywhere in the pipeline, the contamination pathway that produced the original concern no longer exists.</w:t>
       </w:r>
     </w:p>
     <w:p>
@@ -661,7 +542,7 @@
           <w:color w:val="0064B4"/>
           <w:sz w:val="22"/>
         </w:rPr>
-        <w:t xml:space="preserve"> Section IV-A completely rewritten; the isolation assertion is described in prose and reproduced in the released code. The former Table I (TimeGAN configuration) has been removed.</w:t>
+        <w:t xml:space="preserve"> Section IV-A rewritten to describe the unaugmented MATLAB-only pipeline; all prior references to TimeGAN, including the former Table I (TimeGAN configuration) and the augmentation-isolation diagram, have been removed from the manuscript. The reference to Yoon et al.'s TimeGAN paper has also been removed from the bibliography.</w:t>
       </w:r>
     </w:p>
     <w:p>
@@ -3545,7 +3426,7 @@
         <w:drawing>
           <wp:inline xmlns:a="http://schemas.openxmlformats.org/drawingml/2006/main" xmlns:pic="http://schemas.openxmlformats.org/drawingml/2006/picture">
             <wp:extent cx="5029200" cy="1382741"/>
-            <wp:docPr id="2" name="Picture 2"/>
+            <wp:docPr id="1" name="Picture 1"/>
             <wp:cNvGraphicFramePr>
               <a:graphicFrameLocks noChangeAspect="1"/>
             </wp:cNvGraphicFramePr>
@@ -3557,7 +3438,7 @@
                     <pic:cNvPicPr/>
                   </pic:nvPicPr>
                   <pic:blipFill>
-                    <a:blip r:embed="rId10"/>
+                    <a:blip r:embed="rId9"/>
                     <a:stretch>
                       <a:fillRect/>
                     </a:stretch>
@@ -7435,8 +7316,8 @@
       <w:r>
         <w:drawing>
           <wp:inline xmlns:a="http://schemas.openxmlformats.org/drawingml/2006/main" xmlns:pic="http://schemas.openxmlformats.org/drawingml/2006/picture">
-            <wp:extent cx="5029200" cy="3772979"/>
-            <wp:docPr id="3" name="Picture 3"/>
+            <wp:extent cx="5029200" cy="3932704"/>
+            <wp:docPr id="2" name="Picture 2"/>
             <wp:cNvGraphicFramePr>
               <a:graphicFrameLocks noChangeAspect="1"/>
             </wp:cNvGraphicFramePr>
@@ -7448,7 +7329,7 @@
                     <pic:cNvPicPr/>
                   </pic:nvPicPr>
                   <pic:blipFill>
-                    <a:blip r:embed="rId11"/>
+                    <a:blip r:embed="rId10"/>
                     <a:stretch>
                       <a:fillRect/>
                     </a:stretch>
@@ -7456,7 +7337,7 @@
                   <pic:spPr>
                     <a:xfrm>
                       <a:off x="0" y="0"/>
-                      <a:ext cx="5029200" cy="3772979"/>
+                      <a:ext cx="5029200" cy="3932704"/>
                     </a:xfrm>
                     <a:prstGeom prst="rect"/>
                   </pic:spPr>
@@ -9384,7 +9265,7 @@
           <w:color w:val="000000"/>
           <w:sz w:val="22"/>
         </w:rPr>
-        <w:t xml:space="preserve"> The reviewer is correct, and the issue is addressed by the complete reconstruction of the experimental foundation described in our response to Reviewer 1, Comment 1. The augmentation-isolation diagram and the data-loader assertion reproduced there show precisely how the revised pipeline prevents any TimeGAN-generated identifier from reaching the validation or test partition. All results in the revised manuscript are derived from unaugmented MATLAB simulation flights.</w:t>
+        <w:t xml:space="preserve"> The reviewer is correct, and the issue is addressed by the complete reconstruction of the experimental foundation described in our response to Reviewer 1, Comment 1. TimeGAN has been removed from the manuscript and the released pipeline; the revised dataset contains no synthetic data at any stage, so the contamination pathway that produced the original concern no longer exists. All results in the revised manuscript derive exclusively from the 600 unaugmented MATLAB simulation flights in the test split.</w:t>
       </w:r>
     </w:p>
     <w:p>
@@ -9455,7 +9336,7 @@
           <w:color w:val="000000"/>
           <w:sz w:val="22"/>
         </w:rPr>
-        <w:t xml:space="preserve"> The near-uniform conventional metrics in the original submission were a direct consequence of the TimeGAN contamination: synthetic windows generated from training-flight distributions were present in the test set, suppressing discriminative signal and flattening window-level accuracy across all architectures. The clean test set produces clearly differentiated patterns across both metric families, as the tables below show.</w:t>
+        <w:t xml:space="preserve"> The near-uniform conventional metrics in the original submission were a direct consequence of the contaminated test partition: synthetic windows generated from training-flight distributions were present in the test set, suppressing discriminative signal and flattening window-level accuracy across all architectures. With the rebuilt experimental foundation and the unaugmented test set, conventional metrics produce clearly differentiated patterns across architectures, as the tables below show.</w:t>
       </w:r>
     </w:p>
     <w:p>

</xml_diff>